<commit_message>
ToolAndDesign (WordFile) HW1 Fix
</commit_message>
<xml_diff>
--- a/ToolsAndDesign/Разработка Album сover.docx
+++ b/ToolsAndDesign/Разработка Album сover.docx
@@ -2,6 +2,1463 @@
 <file path=word/document.xml><?xml version="1.0" encoding="utf-8"?>
 <w:document xmlns:wpc="http://schemas.microsoft.com/office/word/2010/wordprocessingCanvas" xmlns:cx="http://schemas.microsoft.com/office/drawing/2014/chartex" xmlns:cx1="http://schemas.microsoft.com/office/drawing/2015/9/8/chartex" xmlns:cx2="http://schemas.microsoft.com/office/drawing/2015/10/21/chartex" xmlns:cx3="http://schemas.microsoft.com/office/drawing/2016/5/9/chartex" xmlns:cx4="http://schemas.microsoft.com/office/drawing/2016/5/10/chartex" xmlns:cx5="http://schemas.microsoft.com/office/drawing/2016/5/11/chartex" xmlns:cx6="http://schemas.microsoft.com/office/drawing/2016/5/12/chartex" xmlns:cx7="http://schemas.microsoft.com/office/drawing/2016/5/13/chartex" xmlns:cx8="http://schemas.microsoft.com/office/drawing/2016/5/14/chartex" xmlns:mc="http://schemas.openxmlformats.org/markup-compatibility/2006" xmlns:aink="http://schemas.microsoft.com/office/drawing/2016/ink" xmlns:am3d="http://schemas.microsoft.com/office/drawing/2017/model3d" xmlns:o="urn:schemas-microsoft-com:office:office" xmlns:oel="http://schemas.microsoft.com/office/2019/extlst" xmlns:r="http://schemas.openxmlformats.org/officeDocument/2006/relationships" xmlns:m="http://schemas.openxmlformats.org/officeDocument/2006/math" xmlns:v="urn:schemas-microsoft-com:vml" xmlns:wp14="http://schemas.microsoft.com/office/word/2010/wordprocessingDrawing" xmlns:wp="http://schemas.openxmlformats.org/drawingml/2006/wordprocessingDrawing" xmlns:w10="urn:schemas-microsoft-com:office:word" xmlns:w="http://schemas.openxmlformats.org/wordprocessingml/2006/main" xmlns:w14="http://schemas.microsoft.com/office/word/2010/wordml" xmlns:w15="http://schemas.microsoft.com/office/word/2012/wordml" xmlns:w16cex="http://schemas.microsoft.com/office/word/2018/wordml/cex" xmlns:w16cid="http://schemas.microsoft.com/office/word/2016/wordml/cid" xmlns:w16="http://schemas.microsoft.com/office/word/2018/wordml" xmlns:w16du="http://schemas.microsoft.com/office/word/2023/wordml/word16du" xmlns:w16sdtdh="http://schemas.microsoft.com/office/word/2020/wordml/sdtdatahash" xmlns:w16sdtfl="http://schemas.microsoft.com/office/word/2024/wordml/sdtformatlock" xmlns:w16se="http://schemas.microsoft.com/office/word/2015/wordml/symex" xmlns:wpg="http://schemas.microsoft.com/office/word/2010/wordprocessingGroup" xmlns:wpi="http://schemas.microsoft.com/office/word/2010/wordprocessingInk" xmlns:wne="http://schemas.microsoft.com/office/word/2006/wordml" xmlns:wps="http://schemas.microsoft.com/office/word/2010/wordprocessingShape" mc:Ignorable="w14 w15 w16se w16cid w16 w16cex w16sdtdh w16sdtfl w16du wp14">
   <w:body>
+    <w:p>
+      <w:pPr>
+        <w:widowControl w:val="0"/>
+        <w:suppressAutoHyphens/>
+        <w:spacing w:after="0" w:line="240" w:lineRule="auto"/>
+        <w:jc w:val="center"/>
+        <w:rPr>
+          <w:rFonts w:ascii="Liberation Serif" w:eastAsia="Droid Sans Fallback" w:hAnsi="Liberation Serif" w:cs="Times New Roman"/>
+          <w:szCs w:val="28"/>
+          <w:lang w:eastAsia="zh-CN" w:bidi="hi-IN"/>
+          <w14:ligatures w14:val="none"/>
+        </w:rPr>
+      </w:pPr>
+    </w:p>
+    <w:tbl>
+      <w:tblPr>
+        <w:tblW w:w="0" w:type="auto"/>
+        <w:jc w:val="center"/>
+        <w:tblCellMar>
+          <w:top w:w="15" w:type="dxa"/>
+          <w:left w:w="15" w:type="dxa"/>
+          <w:bottom w:w="15" w:type="dxa"/>
+          <w:right w:w="15" w:type="dxa"/>
+        </w:tblCellMar>
+        <w:tblLook w:val="04A0" w:firstRow="1" w:lastRow="0" w:firstColumn="1" w:lastColumn="0" w:noHBand="0" w:noVBand="1"/>
+      </w:tblPr>
+      <w:tblGrid>
+        <w:gridCol w:w="9355"/>
+      </w:tblGrid>
+      <w:tr>
+        <w:trPr>
+          <w:trHeight w:val="1662"/>
+          <w:jc w:val="center"/>
+        </w:trPr>
+        <w:tc>
+          <w:tcPr>
+            <w:tcW w:w="0" w:type="auto"/>
+            <w:tcMar>
+              <w:top w:w="80" w:type="dxa"/>
+              <w:left w:w="80" w:type="dxa"/>
+              <w:bottom w:w="80" w:type="dxa"/>
+              <w:right w:w="80" w:type="dxa"/>
+            </w:tcMar>
+            <w:hideMark/>
+          </w:tcPr>
+          <w:p>
+            <w:pPr>
+              <w:spacing w:after="0" w:line="240" w:lineRule="auto"/>
+              <w:jc w:val="center"/>
+              <w:rPr>
+                <w:rFonts w:ascii="Times New Roman" w:eastAsia="Times New Roman" w:hAnsi="Times New Roman" w:cs="Times New Roman"/>
+                <w:kern w:val="0"/>
+                <w:lang w:eastAsia="ru-RU"/>
+                <w14:ligatures w14:val="none"/>
+              </w:rPr>
+            </w:pPr>
+            <w:r>
+              <w:rPr>
+                <w:rFonts w:ascii="Times New Roman" w:eastAsia="Times New Roman" w:hAnsi="Times New Roman" w:cs="Times New Roman"/>
+                <w:noProof/>
+                <w:color w:val="000000"/>
+                <w:kern w:val="0"/>
+                <w:sz w:val="22"/>
+                <w:szCs w:val="22"/>
+                <w:bdr w:val="none" w:sz="0" w:space="0" w:color="auto" w:frame="1"/>
+                <w:lang w:eastAsia="ru-RU"/>
+                <w14:ligatures w14:val="none"/>
+              </w:rPr>
+              <w:drawing>
+                <wp:inline distT="0" distB="0" distL="0" distR="0" wp14:anchorId="5040F7D3" wp14:editId="67703CC8">
+                  <wp:extent cx="895350" cy="1009650"/>
+                  <wp:effectExtent l="0" t="0" r="0" b="0"/>
+                  <wp:docPr id="6" name="Рисунок 6"/>
+                  <wp:cNvGraphicFramePr>
+                    <a:graphicFrameLocks xmlns:a="http://schemas.openxmlformats.org/drawingml/2006/main" noChangeAspect="1"/>
+                  </wp:cNvGraphicFramePr>
+                  <a:graphic xmlns:a="http://schemas.openxmlformats.org/drawingml/2006/main">
+                    <a:graphicData uri="http://schemas.openxmlformats.org/drawingml/2006/picture">
+                      <pic:pic xmlns:pic="http://schemas.openxmlformats.org/drawingml/2006/picture">
+                        <pic:nvPicPr>
+                          <pic:cNvPr id="0" name="Picture 6"/>
+                          <pic:cNvPicPr>
+                            <a:picLocks noChangeAspect="1" noChangeArrowheads="1"/>
+                          </pic:cNvPicPr>
+                        </pic:nvPicPr>
+                        <pic:blipFill>
+                          <a:blip r:embed="rId6" cstate="print">
+                            <a:extLst>
+                              <a:ext uri="{28A0092B-C50C-407E-A947-70E740481C1C}">
+                                <a14:useLocalDpi xmlns:a14="http://schemas.microsoft.com/office/drawing/2010/main" val="0"/>
+                              </a:ext>
+                            </a:extLst>
+                          </a:blip>
+                          <a:srcRect/>
+                          <a:stretch>
+                            <a:fillRect/>
+                          </a:stretch>
+                        </pic:blipFill>
+                        <pic:spPr bwMode="auto">
+                          <a:xfrm>
+                            <a:off x="0" y="0"/>
+                            <a:ext cx="895350" cy="1009650"/>
+                          </a:xfrm>
+                          <a:prstGeom prst="rect">
+                            <a:avLst/>
+                          </a:prstGeom>
+                          <a:noFill/>
+                          <a:ln>
+                            <a:noFill/>
+                          </a:ln>
+                        </pic:spPr>
+                      </pic:pic>
+                    </a:graphicData>
+                  </a:graphic>
+                </wp:inline>
+              </w:drawing>
+            </w:r>
+          </w:p>
+        </w:tc>
+      </w:tr>
+      <w:tr>
+        <w:trPr>
+          <w:trHeight w:val="328"/>
+          <w:jc w:val="center"/>
+        </w:trPr>
+        <w:tc>
+          <w:tcPr>
+            <w:tcW w:w="0" w:type="auto"/>
+            <w:tcMar>
+              <w:top w:w="80" w:type="dxa"/>
+              <w:left w:w="80" w:type="dxa"/>
+              <w:bottom w:w="80" w:type="dxa"/>
+              <w:right w:w="80" w:type="dxa"/>
+            </w:tcMar>
+            <w:hideMark/>
+          </w:tcPr>
+          <w:p>
+            <w:pPr>
+              <w:spacing w:after="0" w:line="240" w:lineRule="auto"/>
+              <w:jc w:val="center"/>
+              <w:rPr>
+                <w:rFonts w:ascii="Times New Roman" w:eastAsia="Times New Roman" w:hAnsi="Times New Roman" w:cs="Times New Roman"/>
+                <w:kern w:val="0"/>
+                <w:lang w:eastAsia="ru-RU"/>
+                <w14:ligatures w14:val="none"/>
+              </w:rPr>
+            </w:pPr>
+            <w:r>
+              <w:rPr>
+                <w:rFonts w:ascii="Times New Roman" w:eastAsia="Times New Roman" w:hAnsi="Times New Roman" w:cs="Times New Roman"/>
+                <w:smallCaps/>
+                <w:color w:val="000000"/>
+                <w:kern w:val="0"/>
+                <w:sz w:val="28"/>
+                <w:szCs w:val="28"/>
+                <w:lang w:eastAsia="ru-RU"/>
+                <w14:ligatures w14:val="none"/>
+              </w:rPr>
+              <w:t>МИНОБРНАУКИ РОССИИ</w:t>
+            </w:r>
+          </w:p>
+        </w:tc>
+      </w:tr>
+      <w:tr>
+        <w:trPr>
+          <w:trHeight w:val="1283"/>
+          <w:jc w:val="center"/>
+        </w:trPr>
+        <w:tc>
+          <w:tcPr>
+            <w:tcW w:w="0" w:type="auto"/>
+            <w:tcBorders>
+              <w:bottom w:val="single" w:sz="4" w:space="0" w:color="000000"/>
+            </w:tcBorders>
+            <w:tcMar>
+              <w:top w:w="80" w:type="dxa"/>
+              <w:left w:w="80" w:type="dxa"/>
+              <w:bottom w:w="80" w:type="dxa"/>
+              <w:right w:w="80" w:type="dxa"/>
+            </w:tcMar>
+            <w:hideMark/>
+          </w:tcPr>
+          <w:p>
+            <w:pPr>
+              <w:spacing w:after="0" w:line="240" w:lineRule="auto"/>
+              <w:jc w:val="center"/>
+              <w:outlineLvl w:val="0"/>
+              <w:rPr>
+                <w:rFonts w:ascii="Times New Roman" w:eastAsia="Times New Roman" w:hAnsi="Times New Roman" w:cs="Times New Roman"/>
+                <w:b/>
+                <w:bCs/>
+                <w:kern w:val="36"/>
+                <w:sz w:val="48"/>
+                <w:szCs w:val="48"/>
+                <w:lang w:eastAsia="ru-RU"/>
+                <w14:ligatures w14:val="none"/>
+              </w:rPr>
+            </w:pPr>
+            <w:r>
+              <w:rPr>
+                <w:rFonts w:ascii="Times New Roman" w:eastAsia="Times New Roman" w:hAnsi="Times New Roman" w:cs="Times New Roman"/>
+                <w:color w:val="000000"/>
+                <w:kern w:val="36"/>
+                <w:sz w:val="28"/>
+                <w:szCs w:val="28"/>
+                <w:lang w:eastAsia="ru-RU"/>
+                <w14:ligatures w14:val="none"/>
+              </w:rPr>
+              <w:t>Федеральное государственное бюджетное образовательное учреждение высшего образования</w:t>
+            </w:r>
+          </w:p>
+          <w:p>
+            <w:pPr>
+              <w:spacing w:after="0" w:line="240" w:lineRule="auto"/>
+              <w:jc w:val="center"/>
+              <w:outlineLvl w:val="0"/>
+              <w:rPr>
+                <w:rFonts w:ascii="Times New Roman" w:eastAsia="Times New Roman" w:hAnsi="Times New Roman" w:cs="Times New Roman"/>
+                <w:b/>
+                <w:bCs/>
+                <w:kern w:val="36"/>
+                <w:sz w:val="48"/>
+                <w:szCs w:val="48"/>
+                <w:lang w:eastAsia="ru-RU"/>
+                <w14:ligatures w14:val="none"/>
+              </w:rPr>
+            </w:pPr>
+            <w:r>
+              <w:rPr>
+                <w:rFonts w:ascii="Times New Roman" w:eastAsia="Times New Roman" w:hAnsi="Times New Roman" w:cs="Times New Roman"/>
+                <w:b/>
+                <w:bCs/>
+                <w:color w:val="000000"/>
+                <w:kern w:val="36"/>
+                <w:sz w:val="28"/>
+                <w:szCs w:val="28"/>
+                <w:lang w:eastAsia="ru-RU"/>
+                <w14:ligatures w14:val="none"/>
+              </w:rPr>
+              <w:t xml:space="preserve">«МИРЭА </w:t>
+            </w:r>
+            <w:r>
+              <w:rPr>
+                <w:rFonts w:ascii="Times New Roman" w:eastAsia="Times New Roman" w:hAnsi="Times New Roman" w:cs="Times New Roman"/>
+                <w:color w:val="000000"/>
+                <w:kern w:val="36"/>
+                <w:sz w:val="28"/>
+                <w:szCs w:val="28"/>
+                <w:lang w:eastAsia="ru-RU"/>
+                <w14:ligatures w14:val="none"/>
+              </w:rPr>
+              <w:t xml:space="preserve">- </w:t>
+            </w:r>
+            <w:r>
+              <w:rPr>
+                <w:rFonts w:ascii="Times New Roman" w:eastAsia="Times New Roman" w:hAnsi="Times New Roman" w:cs="Times New Roman"/>
+                <w:b/>
+                <w:bCs/>
+                <w:color w:val="000000"/>
+                <w:kern w:val="36"/>
+                <w:sz w:val="28"/>
+                <w:szCs w:val="28"/>
+                <w:lang w:eastAsia="ru-RU"/>
+                <w14:ligatures w14:val="none"/>
+              </w:rPr>
+              <w:t>Российский технологический университет»</w:t>
+            </w:r>
+          </w:p>
+          <w:p>
+            <w:pPr>
+              <w:spacing w:after="0" w:line="240" w:lineRule="auto"/>
+              <w:jc w:val="center"/>
+              <w:outlineLvl w:val="0"/>
+              <w:rPr>
+                <w:rFonts w:ascii="Times New Roman" w:eastAsia="Times New Roman" w:hAnsi="Times New Roman" w:cs="Times New Roman"/>
+                <w:b/>
+                <w:bCs/>
+                <w:kern w:val="36"/>
+                <w:sz w:val="48"/>
+                <w:szCs w:val="48"/>
+                <w:lang w:eastAsia="ru-RU"/>
+                <w14:ligatures w14:val="none"/>
+              </w:rPr>
+            </w:pPr>
+            <w:r>
+              <w:rPr>
+                <w:rFonts w:ascii="Times New Roman" w:eastAsia="Times New Roman" w:hAnsi="Times New Roman" w:cs="Times New Roman"/>
+                <w:b/>
+                <w:bCs/>
+                <w:color w:val="000000"/>
+                <w:kern w:val="36"/>
+                <w:sz w:val="28"/>
+                <w:szCs w:val="28"/>
+                <w:lang w:eastAsia="ru-RU"/>
+                <w14:ligatures w14:val="none"/>
+              </w:rPr>
+              <w:t>РТУ МИРЭА</w:t>
+            </w:r>
+          </w:p>
+        </w:tc>
+      </w:tr>
+    </w:tbl>
+    <w:p>
+      <w:pPr>
+        <w:spacing w:after="0" w:line="240" w:lineRule="auto"/>
+        <w:rPr>
+          <w:rFonts w:ascii="Times New Roman" w:eastAsia="Times New Roman" w:hAnsi="Times New Roman" w:cs="Times New Roman"/>
+          <w:kern w:val="0"/>
+          <w:lang w:eastAsia="ru-RU"/>
+          <w14:ligatures w14:val="none"/>
+        </w:rPr>
+      </w:pPr>
+    </w:p>
+    <w:p>
+      <w:pPr>
+        <w:spacing w:after="0" w:line="240" w:lineRule="auto"/>
+        <w:jc w:val="center"/>
+        <w:rPr>
+          <w:rFonts w:ascii="Times New Roman" w:eastAsia="Times New Roman" w:hAnsi="Times New Roman" w:cs="Times New Roman"/>
+          <w:kern w:val="0"/>
+          <w:lang w:eastAsia="ru-RU"/>
+          <w14:ligatures w14:val="none"/>
+        </w:rPr>
+      </w:pPr>
+      <w:r>
+        <w:rPr>
+          <w:rFonts w:ascii="Times New Roman" w:eastAsia="Times New Roman" w:hAnsi="Times New Roman" w:cs="Times New Roman"/>
+          <w:color w:val="000000"/>
+          <w:kern w:val="0"/>
+          <w:sz w:val="28"/>
+          <w:szCs w:val="28"/>
+          <w:lang w:eastAsia="ru-RU"/>
+          <w14:ligatures w14:val="none"/>
+        </w:rPr>
+        <w:t>Институт информационных технологий (ИТ)</w:t>
+      </w:r>
+    </w:p>
+    <w:p>
+      <w:pPr>
+        <w:shd w:val="clear" w:color="auto" w:fill="FFFFFF"/>
+        <w:spacing w:after="0" w:line="240" w:lineRule="auto"/>
+        <w:jc w:val="center"/>
+        <w:rPr>
+          <w:rFonts w:ascii="Times New Roman" w:eastAsia="Times New Roman" w:hAnsi="Times New Roman" w:cs="Times New Roman"/>
+          <w:kern w:val="0"/>
+          <w:lang w:eastAsia="ru-RU"/>
+          <w14:ligatures w14:val="none"/>
+        </w:rPr>
+      </w:pPr>
+      <w:r>
+        <w:rPr>
+          <w:rFonts w:ascii="Times New Roman" w:eastAsia="Times New Roman" w:hAnsi="Times New Roman" w:cs="Times New Roman"/>
+          <w:color w:val="000000"/>
+          <w:kern w:val="0"/>
+          <w:sz w:val="28"/>
+          <w:szCs w:val="28"/>
+          <w:lang w:eastAsia="ru-RU"/>
+          <w14:ligatures w14:val="none"/>
+        </w:rPr>
+        <w:t xml:space="preserve">Кафедра </w:t>
+      </w:r>
+      <w:r>
+        <w:rPr>
+          <w:rFonts w:ascii="Times New Roman" w:eastAsia="Times New Roman" w:hAnsi="Times New Roman" w:cs="Times New Roman"/>
+          <w:color w:val="000000"/>
+          <w:kern w:val="0"/>
+          <w:sz w:val="28"/>
+          <w:szCs w:val="28"/>
+          <w:lang w:eastAsia="ru-RU"/>
+          <w14:ligatures w14:val="none"/>
+        </w:rPr>
+        <w:t>игровой индустрии</w:t>
+      </w:r>
+      <w:r>
+        <w:rPr>
+          <w:rFonts w:ascii="Times New Roman" w:eastAsia="Times New Roman" w:hAnsi="Times New Roman" w:cs="Times New Roman"/>
+          <w:color w:val="000000"/>
+          <w:kern w:val="0"/>
+          <w:sz w:val="28"/>
+          <w:szCs w:val="28"/>
+          <w:lang w:eastAsia="ru-RU"/>
+          <w14:ligatures w14:val="none"/>
+        </w:rPr>
+        <w:t xml:space="preserve"> </w:t>
+      </w:r>
+      <w:r>
+        <w:rPr>
+          <w:rFonts w:ascii="Times New Roman" w:eastAsia="Times New Roman" w:hAnsi="Times New Roman" w:cs="Times New Roman"/>
+          <w:color w:val="000000"/>
+          <w:kern w:val="0"/>
+          <w:sz w:val="28"/>
+          <w:szCs w:val="28"/>
+          <w:lang w:eastAsia="ru-RU"/>
+          <w14:ligatures w14:val="none"/>
+        </w:rPr>
+        <w:t>(</w:t>
+      </w:r>
+      <w:r>
+        <w:rPr>
+          <w:rFonts w:ascii="Times New Roman" w:eastAsia="Times New Roman" w:hAnsi="Times New Roman" w:cs="Times New Roman"/>
+          <w:color w:val="000000"/>
+          <w:kern w:val="0"/>
+          <w:sz w:val="28"/>
+          <w:szCs w:val="28"/>
+          <w:lang w:eastAsia="ru-RU"/>
+          <w14:ligatures w14:val="none"/>
+        </w:rPr>
+        <w:t>ИИ</w:t>
+      </w:r>
+      <w:r>
+        <w:rPr>
+          <w:rFonts w:ascii="Times New Roman" w:eastAsia="Times New Roman" w:hAnsi="Times New Roman" w:cs="Times New Roman"/>
+          <w:color w:val="000000"/>
+          <w:kern w:val="0"/>
+          <w:sz w:val="28"/>
+          <w:szCs w:val="28"/>
+          <w:lang w:eastAsia="ru-RU"/>
+          <w14:ligatures w14:val="none"/>
+        </w:rPr>
+        <w:t>)</w:t>
+      </w:r>
+    </w:p>
+    <w:p>
+      <w:pPr>
+        <w:shd w:val="clear" w:color="auto" w:fill="FFFFFF"/>
+        <w:spacing w:after="0" w:line="240" w:lineRule="auto"/>
+        <w:jc w:val="center"/>
+        <w:rPr>
+          <w:rFonts w:ascii="Times New Roman" w:eastAsia="Times New Roman" w:hAnsi="Times New Roman" w:cs="Times New Roman"/>
+          <w:kern w:val="0"/>
+          <w:lang w:eastAsia="ru-RU"/>
+          <w14:ligatures w14:val="none"/>
+        </w:rPr>
+      </w:pPr>
+    </w:p>
+    <w:p>
+      <w:pPr>
+        <w:shd w:val="clear" w:color="auto" w:fill="FFFFFF"/>
+        <w:spacing w:after="0" w:line="240" w:lineRule="auto"/>
+        <w:jc w:val="center"/>
+        <w:rPr>
+          <w:rFonts w:ascii="Times New Roman" w:eastAsia="Times New Roman" w:hAnsi="Times New Roman" w:cs="Times New Roman"/>
+          <w:kern w:val="0"/>
+          <w:lang w:eastAsia="ru-RU"/>
+          <w14:ligatures w14:val="none"/>
+        </w:rPr>
+      </w:pPr>
+    </w:p>
+    <w:p>
+      <w:pPr>
+        <w:shd w:val="clear" w:color="auto" w:fill="FFFFFF"/>
+        <w:spacing w:after="0" w:line="240" w:lineRule="auto"/>
+        <w:jc w:val="center"/>
+        <w:rPr>
+          <w:rFonts w:ascii="Times New Roman" w:eastAsia="Times New Roman" w:hAnsi="Times New Roman" w:cs="Times New Roman"/>
+          <w:kern w:val="0"/>
+          <w:lang w:eastAsia="ru-RU"/>
+          <w14:ligatures w14:val="none"/>
+        </w:rPr>
+      </w:pPr>
+    </w:p>
+    <w:tbl>
+      <w:tblPr>
+        <w:tblW w:w="9376" w:type="dxa"/>
+        <w:jc w:val="center"/>
+        <w:tblCellMar>
+          <w:top w:w="15" w:type="dxa"/>
+          <w:left w:w="15" w:type="dxa"/>
+          <w:bottom w:w="15" w:type="dxa"/>
+          <w:right w:w="15" w:type="dxa"/>
+        </w:tblCellMar>
+        <w:tblLook w:val="04A0" w:firstRow="1" w:lastRow="0" w:firstColumn="1" w:lastColumn="0" w:noHBand="0" w:noVBand="1"/>
+      </w:tblPr>
+      <w:tblGrid>
+        <w:gridCol w:w="7270"/>
+        <w:gridCol w:w="2068"/>
+        <w:gridCol w:w="38"/>
+      </w:tblGrid>
+      <w:tr>
+        <w:trPr>
+          <w:trHeight w:val="328"/>
+          <w:jc w:val="center"/>
+        </w:trPr>
+        <w:tc>
+          <w:tcPr>
+            <w:tcW w:w="9371" w:type="dxa"/>
+            <w:gridSpan w:val="3"/>
+            <w:tcMar>
+              <w:top w:w="80" w:type="dxa"/>
+              <w:left w:w="80" w:type="dxa"/>
+              <w:bottom w:w="80" w:type="dxa"/>
+              <w:right w:w="80" w:type="dxa"/>
+            </w:tcMar>
+            <w:hideMark/>
+          </w:tcPr>
+          <w:p>
+            <w:pPr>
+              <w:shd w:val="clear" w:color="auto" w:fill="FFFFFF"/>
+              <w:spacing w:after="0" w:line="240" w:lineRule="auto"/>
+              <w:jc w:val="center"/>
+              <w:rPr>
+                <w:rFonts w:ascii="Times New Roman" w:eastAsia="Times New Roman" w:hAnsi="Times New Roman" w:cs="Times New Roman"/>
+                <w:kern w:val="0"/>
+                <w:lang w:val="en-US" w:eastAsia="ru-RU"/>
+                <w14:ligatures w14:val="none"/>
+              </w:rPr>
+            </w:pPr>
+            <w:r>
+              <w:rPr>
+                <w:rFonts w:ascii="Times New Roman" w:eastAsia="Times New Roman" w:hAnsi="Times New Roman" w:cs="Times New Roman"/>
+                <w:b/>
+                <w:bCs/>
+                <w:color w:val="000000"/>
+                <w:kern w:val="0"/>
+                <w:sz w:val="28"/>
+                <w:szCs w:val="28"/>
+                <w:lang w:eastAsia="ru-RU"/>
+                <w14:ligatures w14:val="none"/>
+              </w:rPr>
+              <w:t>ОТЧЕТ ПО ПРАКТИЧЕСКОЙ РАБОТЕ №</w:t>
+            </w:r>
+            <w:r>
+              <w:rPr>
+                <w:rFonts w:ascii="Times New Roman" w:eastAsia="Times New Roman" w:hAnsi="Times New Roman" w:cs="Times New Roman"/>
+                <w:b/>
+                <w:bCs/>
+                <w:color w:val="000000"/>
+                <w:kern w:val="0"/>
+                <w:sz w:val="28"/>
+                <w:szCs w:val="28"/>
+                <w:lang w:val="en-US" w:eastAsia="ru-RU"/>
+                <w14:ligatures w14:val="none"/>
+              </w:rPr>
+              <w:t>1</w:t>
+            </w:r>
+          </w:p>
+        </w:tc>
+      </w:tr>
+      <w:tr>
+        <w:trPr>
+          <w:trHeight w:val="328"/>
+          <w:jc w:val="center"/>
+        </w:trPr>
+        <w:tc>
+          <w:tcPr>
+            <w:tcW w:w="9371" w:type="dxa"/>
+            <w:gridSpan w:val="3"/>
+            <w:tcMar>
+              <w:top w:w="80" w:type="dxa"/>
+              <w:left w:w="80" w:type="dxa"/>
+              <w:bottom w:w="80" w:type="dxa"/>
+              <w:right w:w="80" w:type="dxa"/>
+            </w:tcMar>
+            <w:hideMark/>
+          </w:tcPr>
+          <w:p>
+            <w:pPr>
+              <w:shd w:val="clear" w:color="auto" w:fill="FFFFFF"/>
+              <w:spacing w:after="0" w:line="240" w:lineRule="auto"/>
+              <w:jc w:val="center"/>
+              <w:rPr>
+                <w:rFonts w:ascii="Times New Roman" w:eastAsia="Times New Roman" w:hAnsi="Times New Roman" w:cs="Times New Roman"/>
+                <w:kern w:val="0"/>
+                <w:lang w:eastAsia="ru-RU"/>
+                <w14:ligatures w14:val="none"/>
+              </w:rPr>
+            </w:pPr>
+            <w:r>
+              <w:rPr>
+                <w:rFonts w:ascii="Times New Roman" w:eastAsia="Times New Roman" w:hAnsi="Times New Roman" w:cs="Times New Roman"/>
+                <w:b/>
+                <w:bCs/>
+                <w:color w:val="000000"/>
+                <w:kern w:val="0"/>
+                <w:sz w:val="28"/>
+                <w:szCs w:val="28"/>
+                <w:lang w:eastAsia="ru-RU"/>
+                <w14:ligatures w14:val="none"/>
+              </w:rPr>
+              <w:t>по дисциплине</w:t>
+            </w:r>
+          </w:p>
+        </w:tc>
+      </w:tr>
+      <w:tr>
+        <w:trPr>
+          <w:trHeight w:val="1245"/>
+          <w:jc w:val="center"/>
+        </w:trPr>
+        <w:tc>
+          <w:tcPr>
+            <w:tcW w:w="9371" w:type="dxa"/>
+            <w:gridSpan w:val="3"/>
+            <w:tcMar>
+              <w:top w:w="80" w:type="dxa"/>
+              <w:left w:w="80" w:type="dxa"/>
+              <w:bottom w:w="80" w:type="dxa"/>
+              <w:right w:w="80" w:type="dxa"/>
+            </w:tcMar>
+            <w:hideMark/>
+          </w:tcPr>
+          <w:p>
+            <w:pPr>
+              <w:shd w:val="clear" w:color="auto" w:fill="FFFFFF"/>
+              <w:spacing w:after="0" w:line="240" w:lineRule="auto"/>
+              <w:jc w:val="center"/>
+              <w:rPr>
+                <w:rFonts w:ascii="Times New Roman" w:eastAsia="Times New Roman" w:hAnsi="Times New Roman" w:cs="Times New Roman"/>
+                <w:kern w:val="0"/>
+                <w:lang w:eastAsia="ru-RU"/>
+                <w14:ligatures w14:val="none"/>
+              </w:rPr>
+            </w:pPr>
+            <w:r>
+              <w:rPr>
+                <w:rFonts w:ascii="Times New Roman" w:eastAsia="Times New Roman" w:hAnsi="Times New Roman" w:cs="Times New Roman"/>
+                <w:color w:val="000000"/>
+                <w:kern w:val="0"/>
+                <w:sz w:val="28"/>
+                <w:szCs w:val="28"/>
+                <w:lang w:eastAsia="ru-RU"/>
+                <w14:ligatures w14:val="none"/>
+              </w:rPr>
+              <w:t>«</w:t>
+            </w:r>
+            <w:r>
+              <w:rPr>
+                <w:rFonts w:ascii="Times New Roman" w:eastAsia="Droid Sans Fallback" w:hAnsi="Times New Roman" w:cs="Times New Roman"/>
+                <w:sz w:val="28"/>
+                <w:szCs w:val="28"/>
+                <w:lang w:eastAsia="zh-CN" w:bidi="hi-IN"/>
+                <w14:ligatures w14:val="none"/>
+              </w:rPr>
+              <w:t>Инструментальные средства разработки функционала и дизайна компьютерных игр и мультимедийных приложений</w:t>
+            </w:r>
+            <w:r>
+              <w:rPr>
+                <w:rFonts w:ascii="Times New Roman" w:eastAsia="Times New Roman" w:hAnsi="Times New Roman" w:cs="Times New Roman"/>
+                <w:color w:val="000000"/>
+                <w:kern w:val="0"/>
+                <w:sz w:val="28"/>
+                <w:szCs w:val="28"/>
+                <w:lang w:eastAsia="ru-RU"/>
+                <w14:ligatures w14:val="none"/>
+              </w:rPr>
+              <w:t>»</w:t>
+            </w:r>
+          </w:p>
+          <w:p>
+            <w:pPr>
+              <w:shd w:val="clear" w:color="auto" w:fill="FFFFFF"/>
+              <w:spacing w:after="0" w:line="240" w:lineRule="auto"/>
+              <w:rPr>
+                <w:rFonts w:ascii="Times New Roman" w:eastAsia="Times New Roman" w:hAnsi="Times New Roman" w:cs="Times New Roman"/>
+                <w:kern w:val="0"/>
+                <w:lang w:eastAsia="ru-RU"/>
+                <w14:ligatures w14:val="none"/>
+              </w:rPr>
+            </w:pPr>
+          </w:p>
+          <w:p>
+            <w:pPr>
+              <w:shd w:val="clear" w:color="auto" w:fill="FFFFFF"/>
+              <w:spacing w:after="0" w:line="240" w:lineRule="auto"/>
+              <w:rPr>
+                <w:rFonts w:ascii="Times New Roman" w:eastAsia="Times New Roman" w:hAnsi="Times New Roman" w:cs="Times New Roman"/>
+                <w:kern w:val="0"/>
+                <w:lang w:eastAsia="ru-RU"/>
+                <w14:ligatures w14:val="none"/>
+              </w:rPr>
+            </w:pPr>
+          </w:p>
+          <w:p>
+            <w:pPr>
+              <w:shd w:val="clear" w:color="auto" w:fill="FFFFFF"/>
+              <w:spacing w:after="0" w:line="240" w:lineRule="auto"/>
+              <w:rPr>
+                <w:rFonts w:ascii="Times New Roman" w:eastAsia="Times New Roman" w:hAnsi="Times New Roman" w:cs="Times New Roman"/>
+                <w:kern w:val="0"/>
+                <w:lang w:eastAsia="ru-RU"/>
+                <w14:ligatures w14:val="none"/>
+              </w:rPr>
+            </w:pPr>
+          </w:p>
+          <w:p>
+            <w:pPr>
+              <w:shd w:val="clear" w:color="auto" w:fill="FFFFFF"/>
+              <w:spacing w:after="0" w:line="240" w:lineRule="auto"/>
+              <w:rPr>
+                <w:rFonts w:ascii="Times New Roman" w:eastAsia="Times New Roman" w:hAnsi="Times New Roman" w:cs="Times New Roman"/>
+                <w:kern w:val="0"/>
+                <w:lang w:eastAsia="ru-RU"/>
+                <w14:ligatures w14:val="none"/>
+              </w:rPr>
+            </w:pPr>
+          </w:p>
+          <w:p>
+            <w:pPr>
+              <w:shd w:val="clear" w:color="auto" w:fill="FFFFFF"/>
+              <w:spacing w:after="0" w:line="240" w:lineRule="auto"/>
+              <w:jc w:val="center"/>
+              <w:rPr>
+                <w:rFonts w:ascii="Times New Roman" w:eastAsia="Times New Roman" w:hAnsi="Times New Roman" w:cs="Times New Roman"/>
+                <w:kern w:val="0"/>
+                <w:lang w:eastAsia="ru-RU"/>
+                <w14:ligatures w14:val="none"/>
+              </w:rPr>
+            </w:pPr>
+          </w:p>
+        </w:tc>
+      </w:tr>
+      <w:tr>
+        <w:trPr>
+          <w:trHeight w:val="328"/>
+          <w:jc w:val="center"/>
+        </w:trPr>
+        <w:tc>
+          <w:tcPr>
+            <w:tcW w:w="6946" w:type="dxa"/>
+            <w:tcMar>
+              <w:top w:w="80" w:type="dxa"/>
+              <w:left w:w="80" w:type="dxa"/>
+              <w:bottom w:w="80" w:type="dxa"/>
+              <w:right w:w="80" w:type="dxa"/>
+            </w:tcMar>
+            <w:hideMark/>
+          </w:tcPr>
+          <w:p>
+            <w:pPr>
+              <w:spacing w:after="0" w:line="240" w:lineRule="auto"/>
+              <w:ind w:left="-84"/>
+              <w:rPr>
+                <w:rFonts w:ascii="Times New Roman" w:eastAsia="Times New Roman" w:hAnsi="Times New Roman" w:cs="Times New Roman"/>
+                <w:kern w:val="0"/>
+                <w:lang w:eastAsia="ru-RU"/>
+                <w14:ligatures w14:val="none"/>
+              </w:rPr>
+            </w:pPr>
+            <w:r>
+              <w:rPr>
+                <w:rFonts w:ascii="Times New Roman" w:eastAsia="Times New Roman" w:hAnsi="Times New Roman" w:cs="Times New Roman"/>
+                <w:color w:val="000000"/>
+                <w:kern w:val="0"/>
+                <w:sz w:val="28"/>
+                <w:szCs w:val="28"/>
+                <w:lang w:eastAsia="ru-RU"/>
+                <w14:ligatures w14:val="none"/>
+              </w:rPr>
+              <w:t>Выполнил: студент группы ИКБО-33-22</w:t>
+            </w:r>
+          </w:p>
+        </w:tc>
+        <w:tc>
+          <w:tcPr>
+            <w:tcW w:w="0" w:type="auto"/>
+            <w:tcMar>
+              <w:top w:w="80" w:type="dxa"/>
+              <w:left w:w="80" w:type="dxa"/>
+              <w:bottom w:w="80" w:type="dxa"/>
+              <w:right w:w="80" w:type="dxa"/>
+            </w:tcMar>
+            <w:hideMark/>
+          </w:tcPr>
+          <w:p>
+            <w:pPr>
+              <w:shd w:val="clear" w:color="auto" w:fill="FFFFFF"/>
+              <w:spacing w:after="0" w:line="240" w:lineRule="auto"/>
+              <w:ind w:left="-84" w:right="-80"/>
+              <w:jc w:val="right"/>
+              <w:rPr>
+                <w:rFonts w:ascii="Times New Roman" w:eastAsia="Times New Roman" w:hAnsi="Times New Roman" w:cs="Times New Roman"/>
+                <w:kern w:val="0"/>
+                <w:lang w:eastAsia="ru-RU"/>
+                <w14:ligatures w14:val="none"/>
+              </w:rPr>
+            </w:pPr>
+            <w:r>
+              <w:rPr>
+                <w:rFonts w:ascii="Times New Roman" w:eastAsia="Times New Roman" w:hAnsi="Times New Roman" w:cs="Times New Roman"/>
+                <w:color w:val="000000"/>
+                <w:kern w:val="0"/>
+                <w:sz w:val="28"/>
+                <w:szCs w:val="28"/>
+                <w:lang w:eastAsia="ru-RU"/>
+                <w14:ligatures w14:val="none"/>
+              </w:rPr>
+              <w:t>Шило Ю. С.</w:t>
+            </w:r>
+          </w:p>
+        </w:tc>
+        <w:tc>
+          <w:tcPr>
+            <w:tcW w:w="0" w:type="auto"/>
+            <w:vAlign w:val="center"/>
+            <w:hideMark/>
+          </w:tcPr>
+          <w:p>
+            <w:pPr>
+              <w:spacing w:after="0" w:line="240" w:lineRule="auto"/>
+              <w:rPr>
+                <w:rFonts w:ascii="Times New Roman" w:eastAsia="Times New Roman" w:hAnsi="Times New Roman" w:cs="Times New Roman"/>
+                <w:kern w:val="0"/>
+                <w:sz w:val="20"/>
+                <w:szCs w:val="20"/>
+                <w:lang w:eastAsia="ru-RU"/>
+                <w14:ligatures w14:val="none"/>
+              </w:rPr>
+            </w:pPr>
+          </w:p>
+        </w:tc>
+      </w:tr>
+      <w:tr>
+        <w:trPr>
+          <w:trHeight w:val="328"/>
+          <w:jc w:val="center"/>
+        </w:trPr>
+        <w:tc>
+          <w:tcPr>
+            <w:tcW w:w="6946" w:type="dxa"/>
+            <w:tcMar>
+              <w:top w:w="80" w:type="dxa"/>
+              <w:left w:w="80" w:type="dxa"/>
+              <w:bottom w:w="80" w:type="dxa"/>
+              <w:right w:w="80" w:type="dxa"/>
+            </w:tcMar>
+            <w:hideMark/>
+          </w:tcPr>
+          <w:p>
+            <w:pPr>
+              <w:spacing w:after="0" w:line="240" w:lineRule="auto"/>
+              <w:ind w:left="-84"/>
+              <w:rPr>
+                <w:rFonts w:ascii="Times New Roman" w:eastAsia="Times New Roman" w:hAnsi="Times New Roman" w:cs="Times New Roman"/>
+                <w:kern w:val="0"/>
+                <w:lang w:eastAsia="ru-RU"/>
+                <w14:ligatures w14:val="none"/>
+              </w:rPr>
+            </w:pPr>
+            <w:r>
+              <w:rPr>
+                <w:rFonts w:ascii="Times New Roman" w:eastAsia="Times New Roman" w:hAnsi="Times New Roman" w:cs="Times New Roman"/>
+                <w:color w:val="000000"/>
+                <w:kern w:val="0"/>
+                <w:sz w:val="28"/>
+                <w:szCs w:val="28"/>
+                <w:lang w:eastAsia="ru-RU"/>
+                <w14:ligatures w14:val="none"/>
+              </w:rPr>
+              <w:t>Проверил: преподаватель </w:t>
+            </w:r>
+          </w:p>
+        </w:tc>
+        <w:tc>
+          <w:tcPr>
+            <w:tcW w:w="0" w:type="auto"/>
+            <w:tcMar>
+              <w:top w:w="80" w:type="dxa"/>
+              <w:left w:w="80" w:type="dxa"/>
+              <w:bottom w:w="80" w:type="dxa"/>
+              <w:right w:w="80" w:type="dxa"/>
+            </w:tcMar>
+            <w:hideMark/>
+          </w:tcPr>
+          <w:p>
+            <w:pPr>
+              <w:shd w:val="clear" w:color="auto" w:fill="FFFFFF"/>
+              <w:spacing w:after="0" w:line="240" w:lineRule="auto"/>
+              <w:ind w:left="-84" w:right="-80"/>
+              <w:jc w:val="right"/>
+              <w:rPr>
+                <w:rFonts w:ascii="Times New Roman" w:eastAsia="Times New Roman" w:hAnsi="Times New Roman" w:cs="Times New Roman"/>
+                <w:kern w:val="0"/>
+                <w:lang w:eastAsia="ru-RU"/>
+                <w14:ligatures w14:val="none"/>
+              </w:rPr>
+            </w:pPr>
+            <w:r>
+              <w:rPr>
+                <w:rFonts w:ascii="Times New Roman" w:eastAsia="Times New Roman" w:hAnsi="Times New Roman" w:cs="Times New Roman"/>
+                <w:color w:val="000000"/>
+                <w:kern w:val="0"/>
+                <w:sz w:val="28"/>
+                <w:szCs w:val="28"/>
+                <w:lang w:eastAsia="ru-RU"/>
+                <w14:ligatures w14:val="none"/>
+              </w:rPr>
+              <w:t>Чернигин</w:t>
+            </w:r>
+            <w:r>
+              <w:rPr>
+                <w:rFonts w:ascii="Times New Roman" w:eastAsia="Times New Roman" w:hAnsi="Times New Roman" w:cs="Times New Roman"/>
+                <w:color w:val="000000"/>
+                <w:kern w:val="0"/>
+                <w:sz w:val="28"/>
+                <w:szCs w:val="28"/>
+                <w:lang w:eastAsia="ru-RU"/>
+                <w14:ligatures w14:val="none"/>
+              </w:rPr>
+              <w:t xml:space="preserve"> </w:t>
+            </w:r>
+            <w:r>
+              <w:rPr>
+                <w:rFonts w:ascii="Times New Roman" w:eastAsia="Times New Roman" w:hAnsi="Times New Roman" w:cs="Times New Roman"/>
+                <w:color w:val="000000"/>
+                <w:kern w:val="0"/>
+                <w:sz w:val="28"/>
+                <w:szCs w:val="28"/>
+                <w:lang w:eastAsia="ru-RU"/>
+                <w14:ligatures w14:val="none"/>
+              </w:rPr>
+              <w:t>А</w:t>
+            </w:r>
+            <w:r>
+              <w:rPr>
+                <w:rFonts w:ascii="Times New Roman" w:eastAsia="Times New Roman" w:hAnsi="Times New Roman" w:cs="Times New Roman"/>
+                <w:color w:val="000000"/>
+                <w:kern w:val="0"/>
+                <w:sz w:val="28"/>
+                <w:szCs w:val="28"/>
+                <w:lang w:eastAsia="ru-RU"/>
+                <w14:ligatures w14:val="none"/>
+              </w:rPr>
+              <w:t>.</w:t>
+            </w:r>
+            <w:r>
+              <w:rPr>
+                <w:rFonts w:ascii="Times New Roman" w:eastAsia="Times New Roman" w:hAnsi="Times New Roman" w:cs="Times New Roman"/>
+                <w:color w:val="000000"/>
+                <w:kern w:val="0"/>
+                <w:sz w:val="28"/>
+                <w:szCs w:val="28"/>
+                <w:lang w:eastAsia="ru-RU"/>
+                <w14:ligatures w14:val="none"/>
+              </w:rPr>
+              <w:t>Н</w:t>
+            </w:r>
+            <w:r>
+              <w:rPr>
+                <w:rFonts w:ascii="Times New Roman" w:eastAsia="Times New Roman" w:hAnsi="Times New Roman" w:cs="Times New Roman"/>
+                <w:color w:val="000000"/>
+                <w:kern w:val="0"/>
+                <w:sz w:val="28"/>
+                <w:szCs w:val="28"/>
+                <w:lang w:eastAsia="ru-RU"/>
+                <w14:ligatures w14:val="none"/>
+              </w:rPr>
+              <w:t>.</w:t>
+            </w:r>
+          </w:p>
+        </w:tc>
+        <w:tc>
+          <w:tcPr>
+            <w:tcW w:w="0" w:type="auto"/>
+            <w:vAlign w:val="center"/>
+            <w:hideMark/>
+          </w:tcPr>
+          <w:p>
+            <w:pPr>
+              <w:spacing w:after="0" w:line="240" w:lineRule="auto"/>
+              <w:rPr>
+                <w:rFonts w:ascii="Times New Roman" w:eastAsia="Times New Roman" w:hAnsi="Times New Roman" w:cs="Times New Roman"/>
+                <w:kern w:val="0"/>
+                <w:sz w:val="20"/>
+                <w:szCs w:val="20"/>
+                <w:lang w:eastAsia="ru-RU"/>
+                <w14:ligatures w14:val="none"/>
+              </w:rPr>
+            </w:pPr>
+          </w:p>
+        </w:tc>
+      </w:tr>
+      <w:tr>
+        <w:trPr>
+          <w:trHeight w:val="328"/>
+          <w:jc w:val="center"/>
+        </w:trPr>
+        <w:tc>
+          <w:tcPr>
+            <w:tcW w:w="6946" w:type="dxa"/>
+            <w:tcMar>
+              <w:top w:w="80" w:type="dxa"/>
+              <w:left w:w="80" w:type="dxa"/>
+              <w:bottom w:w="80" w:type="dxa"/>
+              <w:right w:w="80" w:type="dxa"/>
+            </w:tcMar>
+            <w:hideMark/>
+          </w:tcPr>
+          <w:p>
+            <w:pPr>
+              <w:spacing w:after="0" w:line="240" w:lineRule="auto"/>
+              <w:rPr>
+                <w:rFonts w:ascii="Times New Roman" w:eastAsia="Times New Roman" w:hAnsi="Times New Roman" w:cs="Times New Roman"/>
+                <w:kern w:val="0"/>
+                <w:lang w:eastAsia="ru-RU"/>
+                <w14:ligatures w14:val="none"/>
+              </w:rPr>
+            </w:pPr>
+          </w:p>
+        </w:tc>
+        <w:tc>
+          <w:tcPr>
+            <w:tcW w:w="0" w:type="auto"/>
+            <w:tcMar>
+              <w:top w:w="80" w:type="dxa"/>
+              <w:left w:w="80" w:type="dxa"/>
+              <w:bottom w:w="80" w:type="dxa"/>
+              <w:right w:w="80" w:type="dxa"/>
+            </w:tcMar>
+            <w:hideMark/>
+          </w:tcPr>
+          <w:p>
+            <w:pPr>
+              <w:shd w:val="clear" w:color="auto" w:fill="FFFFFF"/>
+              <w:spacing w:after="0" w:line="240" w:lineRule="auto"/>
+              <w:ind w:left="-84" w:right="-80"/>
+              <w:jc w:val="right"/>
+              <w:rPr>
+                <w:rFonts w:ascii="Times New Roman" w:eastAsia="Times New Roman" w:hAnsi="Times New Roman" w:cs="Times New Roman"/>
+                <w:kern w:val="0"/>
+                <w:lang w:eastAsia="ru-RU"/>
+                <w14:ligatures w14:val="none"/>
+              </w:rPr>
+            </w:pPr>
+          </w:p>
+        </w:tc>
+        <w:tc>
+          <w:tcPr>
+            <w:tcW w:w="0" w:type="auto"/>
+            <w:vAlign w:val="center"/>
+            <w:hideMark/>
+          </w:tcPr>
+          <w:p>
+            <w:pPr>
+              <w:spacing w:after="0" w:line="240" w:lineRule="auto"/>
+              <w:rPr>
+                <w:rFonts w:ascii="Times New Roman" w:eastAsia="Times New Roman" w:hAnsi="Times New Roman" w:cs="Times New Roman"/>
+                <w:kern w:val="0"/>
+                <w:sz w:val="20"/>
+                <w:szCs w:val="20"/>
+                <w:lang w:eastAsia="ru-RU"/>
+                <w14:ligatures w14:val="none"/>
+              </w:rPr>
+            </w:pPr>
+          </w:p>
+        </w:tc>
+      </w:tr>
+      <w:tr>
+        <w:trPr>
+          <w:trHeight w:val="328"/>
+          <w:jc w:val="center"/>
+        </w:trPr>
+        <w:tc>
+          <w:tcPr>
+            <w:tcW w:w="6946" w:type="dxa"/>
+            <w:tcMar>
+              <w:top w:w="80" w:type="dxa"/>
+              <w:left w:w="80" w:type="dxa"/>
+              <w:bottom w:w="80" w:type="dxa"/>
+              <w:right w:w="80" w:type="dxa"/>
+            </w:tcMar>
+            <w:hideMark/>
+          </w:tcPr>
+          <w:p>
+            <w:pPr>
+              <w:spacing w:after="0" w:line="240" w:lineRule="auto"/>
+              <w:rPr>
+                <w:rFonts w:ascii="Times New Roman" w:eastAsia="Times New Roman" w:hAnsi="Times New Roman" w:cs="Times New Roman"/>
+                <w:kern w:val="0"/>
+                <w:lang w:eastAsia="ru-RU"/>
+                <w14:ligatures w14:val="none"/>
+              </w:rPr>
+            </w:pPr>
+          </w:p>
+        </w:tc>
+        <w:tc>
+          <w:tcPr>
+            <w:tcW w:w="0" w:type="auto"/>
+            <w:tcMar>
+              <w:top w:w="80" w:type="dxa"/>
+              <w:left w:w="80" w:type="dxa"/>
+              <w:bottom w:w="80" w:type="dxa"/>
+              <w:right w:w="80" w:type="dxa"/>
+            </w:tcMar>
+            <w:hideMark/>
+          </w:tcPr>
+          <w:p>
+            <w:pPr>
+              <w:shd w:val="clear" w:color="auto" w:fill="FFFFFF"/>
+              <w:spacing w:after="0" w:line="240" w:lineRule="auto"/>
+              <w:ind w:left="-84" w:right="-80"/>
+              <w:jc w:val="right"/>
+              <w:rPr>
+                <w:rFonts w:ascii="Times New Roman" w:eastAsia="Times New Roman" w:hAnsi="Times New Roman" w:cs="Times New Roman"/>
+                <w:kern w:val="0"/>
+                <w:lang w:eastAsia="ru-RU"/>
+                <w14:ligatures w14:val="none"/>
+              </w:rPr>
+            </w:pPr>
+          </w:p>
+        </w:tc>
+        <w:tc>
+          <w:tcPr>
+            <w:tcW w:w="0" w:type="auto"/>
+            <w:vAlign w:val="center"/>
+            <w:hideMark/>
+          </w:tcPr>
+          <w:p>
+            <w:pPr>
+              <w:spacing w:after="0" w:line="240" w:lineRule="auto"/>
+              <w:rPr>
+                <w:rFonts w:ascii="Times New Roman" w:eastAsia="Times New Roman" w:hAnsi="Times New Roman" w:cs="Times New Roman"/>
+                <w:kern w:val="0"/>
+                <w:sz w:val="20"/>
+                <w:szCs w:val="20"/>
+                <w:lang w:eastAsia="ru-RU"/>
+                <w14:ligatures w14:val="none"/>
+              </w:rPr>
+            </w:pPr>
+          </w:p>
+        </w:tc>
+      </w:tr>
+    </w:tbl>
+    <w:p>
+      <w:pPr>
+        <w:shd w:val="clear" w:color="auto" w:fill="FFFFFF"/>
+        <w:spacing w:after="0" w:line="240" w:lineRule="auto"/>
+        <w:rPr>
+          <w:rFonts w:ascii="Times New Roman" w:eastAsia="Times New Roman" w:hAnsi="Times New Roman" w:cs="Times New Roman"/>
+          <w:kern w:val="0"/>
+          <w:lang w:eastAsia="ru-RU"/>
+          <w14:ligatures w14:val="none"/>
+        </w:rPr>
+      </w:pPr>
+    </w:p>
+    <w:p>
+      <w:pPr>
+        <w:shd w:val="clear" w:color="auto" w:fill="FFFFFF"/>
+        <w:spacing w:after="0" w:line="240" w:lineRule="auto"/>
+        <w:rPr>
+          <w:rFonts w:ascii="Times New Roman" w:eastAsia="Times New Roman" w:hAnsi="Times New Roman" w:cs="Times New Roman"/>
+          <w:kern w:val="0"/>
+          <w:lang w:eastAsia="ru-RU"/>
+          <w14:ligatures w14:val="none"/>
+        </w:rPr>
+      </w:pPr>
+      <w:r>
+        <w:rPr>
+          <w:rFonts w:ascii="Times New Roman" w:eastAsia="Times New Roman" w:hAnsi="Times New Roman" w:cs="Times New Roman"/>
+          <w:color w:val="000000"/>
+          <w:kern w:val="0"/>
+          <w:sz w:val="28"/>
+          <w:szCs w:val="28"/>
+          <w:lang w:eastAsia="ru-RU"/>
+          <w14:ligatures w14:val="none"/>
+        </w:rPr>
+        <w:t>Практическая работа выполнена «</w:t>
+      </w:r>
+      <w:r>
+        <w:rPr>
+          <w:rFonts w:ascii="Times New Roman" w:eastAsia="Times New Roman" w:hAnsi="Times New Roman" w:cs="Times New Roman"/>
+          <w:color w:val="000000"/>
+          <w:kern w:val="0"/>
+          <w:sz w:val="28"/>
+          <w:szCs w:val="28"/>
+          <w:u w:val="single"/>
+          <w:lang w:eastAsia="ru-RU"/>
+          <w14:ligatures w14:val="none"/>
+        </w:rPr>
+        <w:t xml:space="preserve">     </w:t>
+      </w:r>
+      <w:r>
+        <w:rPr>
+          <w:rFonts w:ascii="Times New Roman" w:eastAsia="Times New Roman" w:hAnsi="Times New Roman" w:cs="Times New Roman"/>
+          <w:color w:val="000000"/>
+          <w:kern w:val="0"/>
+          <w:sz w:val="28"/>
+          <w:szCs w:val="28"/>
+          <w:lang w:eastAsia="ru-RU"/>
+          <w14:ligatures w14:val="none"/>
+        </w:rPr>
+        <w:t xml:space="preserve">» </w:t>
+      </w:r>
+      <w:r>
+        <w:rPr>
+          <w:rFonts w:ascii="Times New Roman" w:eastAsia="Times New Roman" w:hAnsi="Times New Roman" w:cs="Times New Roman"/>
+          <w:color w:val="000000"/>
+          <w:kern w:val="0"/>
+          <w:sz w:val="28"/>
+          <w:szCs w:val="28"/>
+          <w:u w:val="single"/>
+          <w:lang w:eastAsia="ru-RU"/>
+          <w14:ligatures w14:val="none"/>
+        </w:rPr>
+        <w:t>                         </w:t>
+      </w:r>
+      <w:r>
+        <w:rPr>
+          <w:rFonts w:ascii="Times New Roman" w:eastAsia="Times New Roman" w:hAnsi="Times New Roman" w:cs="Times New Roman"/>
+          <w:color w:val="000000"/>
+          <w:kern w:val="0"/>
+          <w:sz w:val="28"/>
+          <w:szCs w:val="28"/>
+          <w:lang w:eastAsia="ru-RU"/>
+          <w14:ligatures w14:val="none"/>
+        </w:rPr>
+        <w:t> 2025 г.</w:t>
+      </w:r>
+    </w:p>
+    <w:p>
+      <w:pPr>
+        <w:shd w:val="clear" w:color="auto" w:fill="FFFFFF"/>
+        <w:spacing w:after="0" w:line="240" w:lineRule="auto"/>
+        <w:jc w:val="right"/>
+        <w:rPr>
+          <w:rFonts w:ascii="Times New Roman" w:eastAsia="Times New Roman" w:hAnsi="Times New Roman" w:cs="Times New Roman"/>
+          <w:kern w:val="0"/>
+          <w:lang w:eastAsia="ru-RU"/>
+          <w14:ligatures w14:val="none"/>
+        </w:rPr>
+      </w:pPr>
+      <w:r>
+        <w:rPr>
+          <w:rFonts w:ascii="Times New Roman" w:eastAsia="Times New Roman" w:hAnsi="Times New Roman" w:cs="Times New Roman"/>
+          <w:color w:val="000000"/>
+          <w:kern w:val="0"/>
+          <w:sz w:val="20"/>
+          <w:szCs w:val="20"/>
+          <w:lang w:eastAsia="ru-RU"/>
+          <w14:ligatures w14:val="none"/>
+        </w:rPr>
+        <w:t>(подпись студента)</w:t>
+      </w:r>
+    </w:p>
+    <w:p>
+      <w:pPr>
+        <w:shd w:val="clear" w:color="auto" w:fill="FFFFFF"/>
+        <w:spacing w:after="0" w:line="240" w:lineRule="auto"/>
+        <w:rPr>
+          <w:rFonts w:ascii="Times New Roman" w:eastAsia="Times New Roman" w:hAnsi="Times New Roman" w:cs="Times New Roman"/>
+          <w:kern w:val="0"/>
+          <w:lang w:eastAsia="ru-RU"/>
+          <w14:ligatures w14:val="none"/>
+        </w:rPr>
+      </w:pPr>
+    </w:p>
+    <w:p>
+      <w:pPr>
+        <w:shd w:val="clear" w:color="auto" w:fill="FFFFFF"/>
+        <w:spacing w:after="0" w:line="240" w:lineRule="auto"/>
+        <w:rPr>
+          <w:rFonts w:ascii="Times New Roman" w:eastAsia="Times New Roman" w:hAnsi="Times New Roman" w:cs="Times New Roman"/>
+          <w:kern w:val="0"/>
+          <w:lang w:eastAsia="ru-RU"/>
+          <w14:ligatures w14:val="none"/>
+        </w:rPr>
+      </w:pPr>
+      <w:r>
+        <w:rPr>
+          <w:rFonts w:ascii="Times New Roman" w:eastAsia="Times New Roman" w:hAnsi="Times New Roman" w:cs="Times New Roman"/>
+          <w:color w:val="000000"/>
+          <w:kern w:val="0"/>
+          <w:sz w:val="28"/>
+          <w:szCs w:val="28"/>
+          <w:lang w:eastAsia="ru-RU"/>
+          <w14:ligatures w14:val="none"/>
+        </w:rPr>
+        <w:t>Зачтено «</w:t>
+      </w:r>
+      <w:r>
+        <w:rPr>
+          <w:rFonts w:ascii="Times New Roman" w:eastAsia="Times New Roman" w:hAnsi="Times New Roman" w:cs="Times New Roman"/>
+          <w:color w:val="000000"/>
+          <w:kern w:val="0"/>
+          <w:sz w:val="28"/>
+          <w:szCs w:val="28"/>
+          <w:u w:val="single"/>
+          <w:lang w:eastAsia="ru-RU"/>
+          <w14:ligatures w14:val="none"/>
+        </w:rPr>
+        <w:t xml:space="preserve">     </w:t>
+      </w:r>
+      <w:r>
+        <w:rPr>
+          <w:rFonts w:ascii="Times New Roman" w:eastAsia="Times New Roman" w:hAnsi="Times New Roman" w:cs="Times New Roman"/>
+          <w:color w:val="000000"/>
+          <w:kern w:val="0"/>
+          <w:sz w:val="28"/>
+          <w:szCs w:val="28"/>
+          <w:lang w:eastAsia="ru-RU"/>
+          <w14:ligatures w14:val="none"/>
+        </w:rPr>
+        <w:t xml:space="preserve">» </w:t>
+      </w:r>
+      <w:r>
+        <w:rPr>
+          <w:rFonts w:ascii="Times New Roman" w:eastAsia="Times New Roman" w:hAnsi="Times New Roman" w:cs="Times New Roman"/>
+          <w:color w:val="000000"/>
+          <w:kern w:val="0"/>
+          <w:sz w:val="28"/>
+          <w:szCs w:val="28"/>
+          <w:u w:val="single"/>
+          <w:lang w:eastAsia="ru-RU"/>
+          <w14:ligatures w14:val="none"/>
+        </w:rPr>
+        <w:t>                         </w:t>
+      </w:r>
+      <w:r>
+        <w:rPr>
+          <w:rFonts w:ascii="Times New Roman" w:eastAsia="Times New Roman" w:hAnsi="Times New Roman" w:cs="Times New Roman"/>
+          <w:color w:val="000000"/>
+          <w:kern w:val="0"/>
+          <w:sz w:val="28"/>
+          <w:szCs w:val="28"/>
+          <w:lang w:eastAsia="ru-RU"/>
+          <w14:ligatures w14:val="none"/>
+        </w:rPr>
+        <w:t> 2025 г.</w:t>
+      </w:r>
+    </w:p>
+    <w:p>
+      <w:pPr>
+        <w:shd w:val="clear" w:color="auto" w:fill="FFFFFF"/>
+        <w:spacing w:after="0" w:line="240" w:lineRule="auto"/>
+        <w:jc w:val="right"/>
+        <w:rPr>
+          <w:rFonts w:ascii="Times New Roman" w:eastAsia="Times New Roman" w:hAnsi="Times New Roman" w:cs="Times New Roman"/>
+          <w:kern w:val="0"/>
+          <w:lang w:eastAsia="ru-RU"/>
+          <w14:ligatures w14:val="none"/>
+        </w:rPr>
+      </w:pPr>
+      <w:r>
+        <w:rPr>
+          <w:rFonts w:ascii="Times New Roman" w:eastAsia="Times New Roman" w:hAnsi="Times New Roman" w:cs="Times New Roman"/>
+          <w:color w:val="000000"/>
+          <w:kern w:val="0"/>
+          <w:sz w:val="20"/>
+          <w:szCs w:val="20"/>
+          <w:lang w:eastAsia="ru-RU"/>
+          <w14:ligatures w14:val="none"/>
+        </w:rPr>
+        <w:t>(подпись преподавателя)</w:t>
+      </w:r>
+    </w:p>
+    <w:p>
+      <w:pPr>
+        <w:tabs>
+          <w:tab w:val="center" w:pos="4677"/>
+          <w:tab w:val="right" w:pos="9355"/>
+        </w:tabs>
+        <w:spacing w:after="0" w:line="240" w:lineRule="auto"/>
+        <w:jc w:val="center"/>
+        <w:rPr>
+          <w:rFonts w:ascii="Times New Roman" w:eastAsia="Aptos" w:hAnsi="Times New Roman" w:cs="Times New Roman"/>
+          <w:sz w:val="28"/>
+          <w:szCs w:val="28"/>
+        </w:rPr>
+      </w:pPr>
+    </w:p>
+    <w:p>
+      <w:pPr>
+        <w:tabs>
+          <w:tab w:val="center" w:pos="4677"/>
+          <w:tab w:val="right" w:pos="9355"/>
+        </w:tabs>
+        <w:spacing w:after="0" w:line="240" w:lineRule="auto"/>
+        <w:jc w:val="center"/>
+        <w:rPr>
+          <w:rFonts w:ascii="Times New Roman" w:eastAsia="Aptos" w:hAnsi="Times New Roman" w:cs="Times New Roman"/>
+          <w:sz w:val="28"/>
+          <w:szCs w:val="28"/>
+        </w:rPr>
+      </w:pPr>
+    </w:p>
+    <w:p>
+      <w:pPr>
+        <w:tabs>
+          <w:tab w:val="center" w:pos="4677"/>
+          <w:tab w:val="right" w:pos="9355"/>
+        </w:tabs>
+        <w:spacing w:after="0" w:line="240" w:lineRule="auto"/>
+        <w:jc w:val="center"/>
+        <w:rPr>
+          <w:rFonts w:ascii="Times New Roman" w:eastAsia="Aptos" w:hAnsi="Times New Roman" w:cs="Times New Roman"/>
+          <w:sz w:val="28"/>
+          <w:szCs w:val="28"/>
+        </w:rPr>
+      </w:pPr>
+    </w:p>
+    <w:p>
+      <w:pPr>
+        <w:tabs>
+          <w:tab w:val="center" w:pos="4677"/>
+          <w:tab w:val="right" w:pos="9355"/>
+        </w:tabs>
+        <w:spacing w:after="0" w:line="240" w:lineRule="auto"/>
+        <w:jc w:val="center"/>
+        <w:rPr>
+          <w:rFonts w:ascii="Times New Roman" w:eastAsia="Aptos" w:hAnsi="Times New Roman" w:cs="Times New Roman"/>
+          <w:sz w:val="28"/>
+          <w:szCs w:val="28"/>
+        </w:rPr>
+      </w:pPr>
+    </w:p>
+    <w:p>
+      <w:pPr>
+        <w:tabs>
+          <w:tab w:val="center" w:pos="4677"/>
+          <w:tab w:val="right" w:pos="9355"/>
+        </w:tabs>
+        <w:spacing w:after="0" w:line="240" w:lineRule="auto"/>
+        <w:jc w:val="center"/>
+        <w:rPr>
+          <w:rFonts w:ascii="Times New Roman" w:eastAsia="Aptos" w:hAnsi="Times New Roman" w:cs="Times New Roman"/>
+          <w:sz w:val="28"/>
+          <w:szCs w:val="28"/>
+        </w:rPr>
+      </w:pPr>
+    </w:p>
+    <w:p>
+      <w:pPr>
+        <w:tabs>
+          <w:tab w:val="center" w:pos="4677"/>
+          <w:tab w:val="right" w:pos="9355"/>
+        </w:tabs>
+        <w:spacing w:after="0" w:line="240" w:lineRule="auto"/>
+        <w:jc w:val="center"/>
+        <w:rPr>
+          <w:rFonts w:ascii="Times New Roman" w:eastAsia="Aptos" w:hAnsi="Times New Roman" w:cs="Times New Roman"/>
+          <w:sz w:val="28"/>
+          <w:szCs w:val="28"/>
+        </w:rPr>
+      </w:pPr>
+    </w:p>
+    <w:p>
+      <w:pPr>
+        <w:tabs>
+          <w:tab w:val="center" w:pos="4677"/>
+          <w:tab w:val="right" w:pos="9355"/>
+        </w:tabs>
+        <w:spacing w:after="0" w:line="240" w:lineRule="auto"/>
+        <w:jc w:val="center"/>
+        <w:rPr>
+          <w:rFonts w:ascii="Times New Roman" w:eastAsia="Aptos" w:hAnsi="Times New Roman" w:cs="Times New Roman"/>
+          <w:sz w:val="28"/>
+          <w:szCs w:val="28"/>
+        </w:rPr>
+      </w:pPr>
+      <w:r>
+        <w:rPr>
+          <w:rFonts w:ascii="Times New Roman" w:eastAsia="Aptos" w:hAnsi="Times New Roman" w:cs="Times New Roman"/>
+          <w:sz w:val="28"/>
+          <w:szCs w:val="28"/>
+        </w:rPr>
+        <w:t>Москва 2025</w:t>
+      </w:r>
+    </w:p>
     <w:p>
       <w:pPr>
         <w:pStyle w:val="a7"/>
@@ -20,8 +1477,6 @@
           <w:szCs w:val="28"/>
         </w:rPr>
       </w:pPr>
-      <w:bookmarkStart w:id="0" w:name="_Hlk209522862"/>
-      <w:bookmarkEnd w:id="0"/>
       <w:r>
         <w:rPr>
           <w:rFonts w:ascii="Times New Roman" w:hAnsi="Times New Roman" w:cs="Times New Roman"/>
@@ -30,6 +1485,7 @@
           <w:sz w:val="28"/>
           <w:szCs w:val="28"/>
         </w:rPr>
+        <w:lastRenderedPageBreak/>
         <w:t>Формирование технического задание коммерческой направленности.</w:t>
       </w:r>
     </w:p>
@@ -42,7 +1498,6 @@
           <w:rFonts w:ascii="Times New Roman" w:hAnsi="Times New Roman" w:cs="Times New Roman"/>
           <w:sz w:val="28"/>
           <w:szCs w:val="28"/>
-          <w:lang w:val="en-US"/>
         </w:rPr>
       </w:pPr>
       <w:r>
@@ -131,15 +1586,7 @@
           <w:sz w:val="28"/>
           <w:szCs w:val="28"/>
         </w:rPr>
-        <w:t xml:space="preserve">Дата релиза: </w:t>
-      </w:r>
-      <w:r>
-        <w:rPr>
-          <w:rFonts w:ascii="Times New Roman" w:hAnsi="Times New Roman" w:cs="Times New Roman"/>
-          <w:sz w:val="28"/>
-          <w:szCs w:val="28"/>
-        </w:rPr>
-        <w:t>18 июля 2025 года.</w:t>
+        <w:t>Дата релиза: 18 июля 2025 года.</w:t>
       </w:r>
     </w:p>
     <w:p>
@@ -188,31 +1635,7 @@
           <w:sz w:val="28"/>
           <w:szCs w:val="28"/>
         </w:rPr>
-        <w:t>Возраст</w:t>
-      </w:r>
-      <w:r>
-        <w:rPr>
-          <w:rFonts w:ascii="Times New Roman" w:hAnsi="Times New Roman" w:cs="Times New Roman"/>
-          <w:sz w:val="28"/>
-          <w:szCs w:val="28"/>
-        </w:rPr>
-        <w:t>ной диапазон</w:t>
-      </w:r>
-      <w:r>
-        <w:rPr>
-          <w:rFonts w:ascii="Times New Roman" w:hAnsi="Times New Roman" w:cs="Times New Roman"/>
-          <w:sz w:val="28"/>
-          <w:szCs w:val="28"/>
-        </w:rPr>
-        <w:t xml:space="preserve">: </w:t>
-      </w:r>
-      <w:r>
-        <w:rPr>
-          <w:rFonts w:ascii="Times New Roman" w:hAnsi="Times New Roman" w:cs="Times New Roman"/>
-          <w:sz w:val="28"/>
-          <w:szCs w:val="28"/>
-        </w:rPr>
-        <w:t>16–35 лет</w:t>
+        <w:t>Возрастной диапазон: 16–35 лет</w:t>
       </w:r>
     </w:p>
     <w:p>
@@ -481,17 +1904,7 @@
           <w:sz w:val="28"/>
           <w:szCs w:val="28"/>
         </w:rPr>
-        <w:t>С</w:t>
-      </w:r>
-      <w:r>
-        <w:rPr>
-          <w:rFonts w:ascii="Times New Roman" w:hAnsi="Times New Roman" w:cs="Times New Roman"/>
-          <w:b/>
-          <w:bCs/>
-          <w:sz w:val="28"/>
-          <w:szCs w:val="28"/>
-        </w:rPr>
-        <w:t>тилистические особенности</w:t>
+        <w:t>Анализ исполнителя</w:t>
       </w:r>
     </w:p>
     <w:p>
@@ -511,16 +1924,191 @@
           <w:rFonts w:ascii="Times New Roman" w:hAnsi="Times New Roman" w:cs="Times New Roman"/>
           <w:sz w:val="28"/>
           <w:szCs w:val="28"/>
-        </w:rPr>
-        <w:t xml:space="preserve">Стилистика визуала: </w:t>
-      </w:r>
-      <w:r>
-        <w:rPr>
-          <w:rFonts w:ascii="Times New Roman" w:hAnsi="Times New Roman" w:cs="Times New Roman"/>
-          <w:sz w:val="28"/>
-          <w:szCs w:val="28"/>
-        </w:rPr>
-        <w:t>эстетика темных цветов, минимализм, неоновые акценты.</w:t>
+          <w:lang w:val="en-US"/>
+        </w:rPr>
+        <w:t>Marino</w:t>
+      </w:r>
+      <w:r>
+        <w:rPr>
+          <w:rFonts w:ascii="Times New Roman" w:hAnsi="Times New Roman" w:cs="Times New Roman"/>
+          <w:sz w:val="28"/>
+          <w:szCs w:val="28"/>
+        </w:rPr>
+        <w:t xml:space="preserve"> </w:t>
+      </w:r>
+      <w:r>
+        <w:rPr>
+          <w:rFonts w:ascii="Times New Roman" w:hAnsi="Times New Roman" w:cs="Times New Roman"/>
+          <w:sz w:val="28"/>
+          <w:szCs w:val="28"/>
+        </w:rPr>
+        <w:t xml:space="preserve">американский исполнитель. </w:t>
+      </w:r>
+      <w:r>
+        <w:rPr>
+          <w:rFonts w:ascii="Times New Roman" w:hAnsi="Times New Roman" w:cs="Times New Roman"/>
+          <w:sz w:val="28"/>
+          <w:szCs w:val="28"/>
+        </w:rPr>
+        <w:t>Большинство</w:t>
+      </w:r>
+      <w:r>
+        <w:rPr>
+          <w:rFonts w:ascii="Times New Roman" w:hAnsi="Times New Roman" w:cs="Times New Roman"/>
+          <w:sz w:val="28"/>
+          <w:szCs w:val="28"/>
+        </w:rPr>
+        <w:t xml:space="preserve"> выпущенных треков</w:t>
+      </w:r>
+      <w:r>
+        <w:rPr>
+          <w:rFonts w:ascii="Times New Roman" w:hAnsi="Times New Roman" w:cs="Times New Roman"/>
+          <w:sz w:val="28"/>
+          <w:szCs w:val="28"/>
+        </w:rPr>
+        <w:t xml:space="preserve"> написано в жанре электроника, поп, альтернатив и </w:t>
+      </w:r>
+      <w:r>
+        <w:rPr>
+          <w:rFonts w:ascii="Times New Roman" w:hAnsi="Times New Roman" w:cs="Times New Roman"/>
+          <w:sz w:val="28"/>
+          <w:szCs w:val="28"/>
+        </w:rPr>
+        <w:t>ф</w:t>
+      </w:r>
+      <w:r>
+        <w:rPr>
+          <w:rFonts w:ascii="Times New Roman" w:hAnsi="Times New Roman" w:cs="Times New Roman"/>
+          <w:sz w:val="28"/>
+          <w:szCs w:val="28"/>
+        </w:rPr>
+        <w:t>ьюче-бейс</w:t>
+      </w:r>
+      <w:r>
+        <w:rPr>
+          <w:rFonts w:ascii="Times New Roman" w:hAnsi="Times New Roman" w:cs="Times New Roman"/>
+          <w:sz w:val="28"/>
+          <w:szCs w:val="28"/>
+        </w:rPr>
+        <w:t>.</w:t>
+      </w:r>
+      <w:r>
+        <w:rPr>
+          <w:rFonts w:ascii="Times New Roman" w:hAnsi="Times New Roman" w:cs="Times New Roman"/>
+          <w:sz w:val="28"/>
+          <w:szCs w:val="28"/>
+        </w:rPr>
+        <w:t xml:space="preserve"> </w:t>
+      </w:r>
+      <w:r>
+        <w:rPr>
+          <w:rFonts w:ascii="Times New Roman" w:hAnsi="Times New Roman" w:cs="Times New Roman"/>
+          <w:sz w:val="28"/>
+          <w:szCs w:val="28"/>
+        </w:rPr>
+        <w:t xml:space="preserve">Первый трек появился около трех лет назад. </w:t>
+      </w:r>
+      <w:r>
+        <w:rPr>
+          <w:rFonts w:ascii="Times New Roman" w:hAnsi="Times New Roman" w:cs="Times New Roman"/>
+          <w:sz w:val="28"/>
+          <w:szCs w:val="28"/>
+        </w:rPr>
+        <w:t xml:space="preserve">Всего было выпущено 22 трека в составе 20 альбомов. </w:t>
+      </w:r>
+      <w:r>
+        <w:rPr>
+          <w:rFonts w:ascii="Times New Roman" w:hAnsi="Times New Roman" w:cs="Times New Roman"/>
+          <w:sz w:val="28"/>
+          <w:szCs w:val="28"/>
+        </w:rPr>
+        <w:t>В большинстве случаях альбомы это синглы.</w:t>
+      </w:r>
+      <w:r>
+        <w:rPr>
+          <w:rFonts w:ascii="Times New Roman" w:hAnsi="Times New Roman" w:cs="Times New Roman"/>
+          <w:sz w:val="28"/>
+          <w:szCs w:val="28"/>
+        </w:rPr>
+        <w:t xml:space="preserve"> </w:t>
+      </w:r>
+      <w:r>
+        <w:rPr>
+          <w:rFonts w:ascii="Times New Roman" w:hAnsi="Times New Roman" w:cs="Times New Roman"/>
+          <w:sz w:val="28"/>
+          <w:szCs w:val="28"/>
+        </w:rPr>
+        <w:t>Треки исполнительно слушают в большей степени на территории Англии, Америки, Прага, Германия, Австралия</w:t>
+      </w:r>
+      <w:r>
+        <w:rPr>
+          <w:rFonts w:ascii="Times New Roman" w:hAnsi="Times New Roman" w:cs="Times New Roman"/>
+          <w:sz w:val="28"/>
+          <w:szCs w:val="28"/>
+        </w:rPr>
+        <w:t xml:space="preserve"> (согласно статистики </w:t>
+      </w:r>
+      <w:r>
+        <w:rPr>
+          <w:rFonts w:ascii="Times New Roman" w:hAnsi="Times New Roman" w:cs="Times New Roman"/>
+          <w:sz w:val="28"/>
+          <w:szCs w:val="28"/>
+          <w:lang w:val="en-US"/>
+        </w:rPr>
+        <w:t>Spotify</w:t>
+      </w:r>
+      <w:r>
+        <w:rPr>
+          <w:rFonts w:ascii="Times New Roman" w:hAnsi="Times New Roman" w:cs="Times New Roman"/>
+          <w:sz w:val="28"/>
+          <w:szCs w:val="28"/>
+        </w:rPr>
+        <w:t>)</w:t>
+      </w:r>
+      <w:r>
+        <w:rPr>
+          <w:rFonts w:ascii="Times New Roman" w:hAnsi="Times New Roman" w:cs="Times New Roman"/>
+          <w:sz w:val="28"/>
+          <w:szCs w:val="28"/>
+        </w:rPr>
+        <w:t xml:space="preserve">.  </w:t>
+      </w:r>
+      <w:r>
+        <w:rPr>
+          <w:rFonts w:ascii="Times New Roman" w:hAnsi="Times New Roman" w:cs="Times New Roman"/>
+          <w:sz w:val="28"/>
+          <w:szCs w:val="28"/>
+        </w:rPr>
+        <w:t>Трек последний на данный момент. Сохраняет все основные элементы исполнителя, по этому должен быть в той же стилистике, как и ранние треки.</w:t>
+      </w:r>
+    </w:p>
+    <w:p>
+      <w:pPr>
+        <w:pStyle w:val="a7"/>
+        <w:numPr>
+          <w:ilvl w:val="1"/>
+          <w:numId w:val="1"/>
+        </w:numPr>
+        <w:spacing w:after="0" w:line="360" w:lineRule="auto"/>
+        <w:ind w:left="0" w:firstLine="709"/>
+        <w:jc w:val="both"/>
+        <w:rPr>
+          <w:rFonts w:ascii="Times New Roman" w:hAnsi="Times New Roman" w:cs="Times New Roman"/>
+          <w:b/>
+          <w:bCs/>
+          <w:sz w:val="28"/>
+          <w:szCs w:val="28"/>
+        </w:rPr>
+      </w:pPr>
+      <w:r>
+        <w:rPr>
+          <w:rFonts w:ascii="Times New Roman" w:hAnsi="Times New Roman" w:cs="Times New Roman"/>
+          <w:b/>
+          <w:bCs/>
+          <w:sz w:val="28"/>
+          <w:szCs w:val="28"/>
+        </w:rPr>
+        <w:t>Стилистические особенности</w:t>
       </w:r>
     </w:p>
     <w:p>
@@ -541,6 +2129,36 @@
           <w:sz w:val="28"/>
           <w:szCs w:val="28"/>
         </w:rPr>
+        <w:t xml:space="preserve">Стилистика визуала: </w:t>
+      </w:r>
+      <w:r>
+        <w:rPr>
+          <w:rFonts w:ascii="Times New Roman" w:hAnsi="Times New Roman" w:cs="Times New Roman"/>
+          <w:sz w:val="28"/>
+          <w:szCs w:val="28"/>
+        </w:rPr>
+        <w:t>эстетика темных цветов, минимализм, неоновые акценты.</w:t>
+      </w:r>
+    </w:p>
+    <w:p>
+      <w:pPr>
+        <w:pStyle w:val="a7"/>
+        <w:spacing w:after="0" w:line="360" w:lineRule="auto"/>
+        <w:ind w:left="0" w:firstLine="709"/>
+        <w:jc w:val="both"/>
+        <w:rPr>
+          <w:rFonts w:ascii="Times New Roman" w:hAnsi="Times New Roman" w:cs="Times New Roman"/>
+          <w:sz w:val="28"/>
+          <w:szCs w:val="28"/>
+        </w:rPr>
+      </w:pPr>
+      <w:r>
+        <w:rPr>
+          <w:rFonts w:ascii="Times New Roman" w:hAnsi="Times New Roman" w:cs="Times New Roman"/>
+          <w:sz w:val="28"/>
+          <w:szCs w:val="28"/>
+        </w:rPr>
+        <w:lastRenderedPageBreak/>
         <w:t xml:space="preserve">Цветовые решения: неоновые акценты, преобладание темных цветов, использование </w:t>
       </w:r>
       <w:r>
@@ -725,7 +2343,6 @@
           <w:sz w:val="28"/>
           <w:szCs w:val="28"/>
         </w:rPr>
-        <w:lastRenderedPageBreak/>
         <w:t>Максимальный объем файла: до 20 МБ.</w:t>
       </w:r>
     </w:p>
@@ -785,7 +2402,90 @@
           <w:sz w:val="28"/>
           <w:szCs w:val="28"/>
         </w:rPr>
-        <w:t>Совместимость: адаптация под форматы популярных музыкальных стриминговых сервисов.</w:t>
+        <w:t>Совместимость: адаптация под форматы популярных музыкальных стриминговых сервисов</w:t>
+      </w:r>
+      <w:r>
+        <w:rPr>
+          <w:rFonts w:ascii="Times New Roman" w:hAnsi="Times New Roman" w:cs="Times New Roman"/>
+          <w:sz w:val="28"/>
+          <w:szCs w:val="28"/>
+        </w:rPr>
+        <w:t xml:space="preserve"> (</w:t>
+      </w:r>
+      <w:r>
+        <w:rPr>
+          <w:rFonts w:ascii="Times New Roman" w:hAnsi="Times New Roman" w:cs="Times New Roman"/>
+          <w:sz w:val="28"/>
+          <w:szCs w:val="28"/>
+          <w:lang w:val="en-US"/>
+        </w:rPr>
+        <w:t>Spotify</w:t>
+      </w:r>
+      <w:r>
+        <w:rPr>
+          <w:rFonts w:ascii="Times New Roman" w:hAnsi="Times New Roman" w:cs="Times New Roman"/>
+          <w:sz w:val="28"/>
+          <w:szCs w:val="28"/>
+        </w:rPr>
+        <w:t xml:space="preserve">, </w:t>
+      </w:r>
+      <w:r>
+        <w:rPr>
+          <w:rFonts w:ascii="Times New Roman" w:hAnsi="Times New Roman" w:cs="Times New Roman"/>
+          <w:sz w:val="28"/>
+          <w:szCs w:val="28"/>
+          <w:lang w:val="en-US"/>
+        </w:rPr>
+        <w:t>YouTube</w:t>
+      </w:r>
+      <w:r>
+        <w:rPr>
+          <w:rFonts w:ascii="Times New Roman" w:hAnsi="Times New Roman" w:cs="Times New Roman"/>
+          <w:sz w:val="28"/>
+          <w:szCs w:val="28"/>
+        </w:rPr>
+        <w:t xml:space="preserve"> </w:t>
+      </w:r>
+      <w:r>
+        <w:rPr>
+          <w:rFonts w:ascii="Times New Roman" w:hAnsi="Times New Roman" w:cs="Times New Roman"/>
+          <w:sz w:val="28"/>
+          <w:szCs w:val="28"/>
+          <w:lang w:val="en-US"/>
+        </w:rPr>
+        <w:t>Music</w:t>
+      </w:r>
+      <w:r>
+        <w:rPr>
+          <w:rFonts w:ascii="Times New Roman" w:hAnsi="Times New Roman" w:cs="Times New Roman"/>
+          <w:sz w:val="28"/>
+          <w:szCs w:val="28"/>
+        </w:rPr>
+        <w:t xml:space="preserve">, </w:t>
+      </w:r>
+      <w:r>
+        <w:rPr>
+          <w:rFonts w:ascii="Times New Roman" w:hAnsi="Times New Roman" w:cs="Times New Roman"/>
+          <w:sz w:val="28"/>
+          <w:szCs w:val="28"/>
+        </w:rPr>
+        <w:t>Яндекс музыка</w:t>
+      </w:r>
+      <w:r>
+        <w:rPr>
+          <w:rFonts w:ascii="Times New Roman" w:hAnsi="Times New Roman" w:cs="Times New Roman"/>
+          <w:sz w:val="28"/>
+          <w:szCs w:val="28"/>
+        </w:rPr>
+        <w:t>)</w:t>
+      </w:r>
+      <w:r>
+        <w:rPr>
+          <w:rFonts w:ascii="Times New Roman" w:hAnsi="Times New Roman" w:cs="Times New Roman"/>
+          <w:sz w:val="28"/>
+          <w:szCs w:val="28"/>
+        </w:rPr>
+        <w:t>.</w:t>
       </w:r>
     </w:p>
     <w:p>
@@ -827,46 +2527,42 @@
           <w:noProof/>
           <w:sz w:val="28"/>
           <w:szCs w:val="28"/>
-        </w:rPr>
-      </w:pPr>
-      <w:r>
-        <w:rPr>
-          <w:rFonts w:ascii="Times New Roman" w:hAnsi="Times New Roman" w:cs="Times New Roman"/>
-          <w:noProof/>
-          <w:sz w:val="28"/>
-          <w:szCs w:val="28"/>
-        </w:rPr>
-        <w:t>Поиск референс набора производился на нескольких крупных веб-платформах</w:t>
-      </w:r>
-      <w:r>
-        <w:rPr>
-          <w:rFonts w:ascii="Times New Roman" w:hAnsi="Times New Roman" w:cs="Times New Roman"/>
-          <w:noProof/>
-          <w:sz w:val="28"/>
-          <w:szCs w:val="28"/>
-        </w:rPr>
-        <w:t xml:space="preserve">: </w:t>
-      </w:r>
-      <w:r>
-        <w:rPr>
-          <w:rFonts w:ascii="Times New Roman" w:hAnsi="Times New Roman" w:cs="Times New Roman"/>
-          <w:noProof/>
-          <w:sz w:val="28"/>
-          <w:szCs w:val="28"/>
           <w:lang w:val="en-US"/>
         </w:rPr>
-        <w:t>Pinterest</w:t>
-      </w:r>
-      <w:r>
-        <w:rPr>
-          <w:rFonts w:ascii="Times New Roman" w:hAnsi="Times New Roman" w:cs="Times New Roman"/>
-          <w:noProof/>
-          <w:sz w:val="28"/>
-          <w:szCs w:val="28"/>
-        </w:rPr>
-        <w:t xml:space="preserve">, </w:t>
-      </w:r>
-      <w:r>
+      </w:pPr>
+      <w:r>
+        <w:rPr>
+          <w:rFonts w:ascii="Times New Roman" w:hAnsi="Times New Roman" w:cs="Times New Roman"/>
+          <w:noProof/>
+          <w:sz w:val="28"/>
+          <w:szCs w:val="28"/>
+        </w:rPr>
+        <w:t>Перед созданием референс набора и постера проанализируем прошлые постеры исполнителя. Для анализа возьмем несколько треков. Их постеры предоставлены на рисунках 1-</w:t>
+      </w:r>
+      <w:r>
+        <w:rPr>
+          <w:rFonts w:ascii="Times New Roman" w:hAnsi="Times New Roman" w:cs="Times New Roman"/>
+          <w:noProof/>
+          <w:sz w:val="28"/>
+          <w:szCs w:val="28"/>
+        </w:rPr>
+        <w:t>4</w:t>
+      </w:r>
+      <w:r>
+        <w:rPr>
+          <w:rFonts w:ascii="Times New Roman" w:hAnsi="Times New Roman" w:cs="Times New Roman"/>
+          <w:noProof/>
+          <w:sz w:val="28"/>
+          <w:szCs w:val="28"/>
+        </w:rPr>
+        <w:t>.</w:t>
+      </w:r>
+    </w:p>
+    <w:p>
+      <w:pPr>
+        <w:spacing w:after="0" w:line="240" w:lineRule="auto"/>
+        <w:ind w:firstLine="709"/>
+        <w:jc w:val="center"/>
         <w:rPr>
           <w:rFonts w:ascii="Times New Roman" w:hAnsi="Times New Roman" w:cs="Times New Roman"/>
           <w:noProof/>
@@ -874,16 +2570,108 @@
           <w:szCs w:val="28"/>
           <w:lang w:val="en-US"/>
         </w:rPr>
-        <w:t>ArtStation</w:t>
-      </w:r>
-      <w:r>
-        <w:rPr>
-          <w:rFonts w:ascii="Times New Roman" w:hAnsi="Times New Roman" w:cs="Times New Roman"/>
-          <w:noProof/>
-          <w:sz w:val="28"/>
-          <w:szCs w:val="28"/>
-        </w:rPr>
-        <w:t xml:space="preserve"> и</w:t>
+      </w:pPr>
+      <w:r>
+        <w:rPr>
+          <w:noProof/>
+        </w:rPr>
+        <w:drawing>
+          <wp:inline distT="0" distB="0" distL="0" distR="0" wp14:anchorId="2529C97A" wp14:editId="3DD50D42">
+            <wp:extent cx="2520000" cy="2520000"/>
+            <wp:effectExtent l="0" t="0" r="0" b="0"/>
+            <wp:docPr id="1204615536" name="Рисунок 2"/>
+            <wp:cNvGraphicFramePr>
+              <a:graphicFrameLocks xmlns:a="http://schemas.openxmlformats.org/drawingml/2006/main" noChangeAspect="1"/>
+            </wp:cNvGraphicFramePr>
+            <a:graphic xmlns:a="http://schemas.openxmlformats.org/drawingml/2006/main">
+              <a:graphicData uri="http://schemas.openxmlformats.org/drawingml/2006/picture">
+                <pic:pic xmlns:pic="http://schemas.openxmlformats.org/drawingml/2006/picture">
+                  <pic:nvPicPr>
+                    <pic:cNvPr id="0" name="Picture 3"/>
+                    <pic:cNvPicPr>
+                      <a:picLocks noChangeAspect="1" noChangeArrowheads="1"/>
+                    </pic:cNvPicPr>
+                  </pic:nvPicPr>
+                  <pic:blipFill>
+                    <a:blip r:embed="rId7">
+                      <a:extLst>
+                        <a:ext uri="{28A0092B-C50C-407E-A947-70E740481C1C}">
+                          <a14:useLocalDpi xmlns:a14="http://schemas.microsoft.com/office/drawing/2010/main" val="0"/>
+                        </a:ext>
+                      </a:extLst>
+                    </a:blip>
+                    <a:srcRect/>
+                    <a:stretch>
+                      <a:fillRect/>
+                    </a:stretch>
+                  </pic:blipFill>
+                  <pic:spPr bwMode="auto">
+                    <a:xfrm>
+                      <a:off x="0" y="0"/>
+                      <a:ext cx="2520000" cy="2520000"/>
+                    </a:xfrm>
+                    <a:prstGeom prst="rect">
+                      <a:avLst/>
+                    </a:prstGeom>
+                    <a:noFill/>
+                    <a:ln>
+                      <a:noFill/>
+                    </a:ln>
+                  </pic:spPr>
+                </pic:pic>
+              </a:graphicData>
+            </a:graphic>
+          </wp:inline>
+        </w:drawing>
+      </w:r>
+    </w:p>
+    <w:p>
+      <w:pPr>
+        <w:spacing w:line="240" w:lineRule="auto"/>
+        <w:ind w:firstLine="709"/>
+        <w:jc w:val="center"/>
+        <w:rPr>
+          <w:rFonts w:ascii="Times New Roman" w:hAnsi="Times New Roman" w:cs="Times New Roman"/>
+          <w:sz w:val="28"/>
+          <w:szCs w:val="28"/>
+        </w:rPr>
+      </w:pPr>
+      <w:r>
+        <w:rPr>
+          <w:rFonts w:ascii="Times New Roman" w:hAnsi="Times New Roman" w:cs="Times New Roman"/>
+          <w:noProof/>
+          <w:sz w:val="28"/>
+          <w:szCs w:val="28"/>
+        </w:rPr>
+        <w:t xml:space="preserve">Рисунок </w:t>
+      </w:r>
+      <w:r>
+        <w:rPr>
+          <w:rFonts w:ascii="Times New Roman" w:hAnsi="Times New Roman" w:cs="Times New Roman"/>
+          <w:noProof/>
+          <w:sz w:val="28"/>
+          <w:szCs w:val="28"/>
+        </w:rPr>
+        <w:t>1</w:t>
+      </w:r>
+      <w:r>
+        <w:rPr>
+          <w:rFonts w:ascii="Times New Roman" w:hAnsi="Times New Roman" w:cs="Times New Roman"/>
+          <w:noProof/>
+          <w:sz w:val="28"/>
+          <w:szCs w:val="28"/>
+        </w:rPr>
+        <w:t xml:space="preserve"> – постер к треку </w:t>
+      </w:r>
+      <w:r>
+        <w:rPr>
+          <w:rFonts w:ascii="Times New Roman" w:hAnsi="Times New Roman" w:cs="Times New Roman"/>
+          <w:noProof/>
+          <w:sz w:val="28"/>
+          <w:szCs w:val="28"/>
+          <w:lang w:val="en-US"/>
+        </w:rPr>
+        <w:t>Devil</w:t>
       </w:r>
       <w:r>
         <w:rPr>
@@ -902,16 +2690,451 @@
           <w:szCs w:val="28"/>
           <w:lang w:val="en-US"/>
         </w:rPr>
-        <w:t>Behance</w:t>
-      </w:r>
-      <w:r>
-        <w:rPr>
-          <w:rFonts w:ascii="Times New Roman" w:hAnsi="Times New Roman" w:cs="Times New Roman"/>
-          <w:noProof/>
-          <w:sz w:val="28"/>
-          <w:szCs w:val="28"/>
-        </w:rPr>
-        <w:t>.</w:t>
+        <w:t>in</w:t>
+      </w:r>
+      <w:r>
+        <w:rPr>
+          <w:rFonts w:ascii="Times New Roman" w:hAnsi="Times New Roman" w:cs="Times New Roman"/>
+          <w:noProof/>
+          <w:sz w:val="28"/>
+          <w:szCs w:val="28"/>
+        </w:rPr>
+        <w:t xml:space="preserve"> </w:t>
+      </w:r>
+      <w:r>
+        <w:rPr>
+          <w:rFonts w:ascii="Times New Roman" w:hAnsi="Times New Roman" w:cs="Times New Roman"/>
+          <w:sz w:val="28"/>
+          <w:szCs w:val="28"/>
+          <w:lang w:val="en-US"/>
+        </w:rPr>
+        <w:t>Disguise</w:t>
+      </w:r>
+      <w:r>
+        <w:rPr>
+          <w:rFonts w:ascii="Times New Roman" w:hAnsi="Times New Roman" w:cs="Times New Roman"/>
+          <w:sz w:val="28"/>
+          <w:szCs w:val="28"/>
+        </w:rPr>
+        <w:t xml:space="preserve"> (2025 год)</w:t>
+      </w:r>
+    </w:p>
+    <w:p>
+      <w:pPr>
+        <w:spacing w:after="0" w:line="360" w:lineRule="auto"/>
+        <w:ind w:firstLine="709"/>
+        <w:jc w:val="center"/>
+        <w:rPr>
+          <w:rFonts w:ascii="Times New Roman" w:hAnsi="Times New Roman" w:cs="Times New Roman"/>
+          <w:noProof/>
+          <w:sz w:val="28"/>
+          <w:szCs w:val="28"/>
+        </w:rPr>
+      </w:pPr>
+    </w:p>
+    <w:p>
+      <w:pPr>
+        <w:spacing w:after="0" w:line="240" w:lineRule="auto"/>
+        <w:ind w:firstLine="709"/>
+        <w:jc w:val="center"/>
+        <w:rPr>
+          <w:rFonts w:ascii="Times New Roman" w:hAnsi="Times New Roman" w:cs="Times New Roman"/>
+          <w:sz w:val="28"/>
+          <w:szCs w:val="28"/>
+          <w:lang w:val="en-US"/>
+        </w:rPr>
+      </w:pPr>
+      <w:r>
+        <w:rPr>
+          <w:noProof/>
+        </w:rPr>
+        <w:lastRenderedPageBreak/>
+        <w:drawing>
+          <wp:inline distT="0" distB="0" distL="0" distR="0" wp14:anchorId="4681DF9F" wp14:editId="78DAEAED">
+            <wp:extent cx="2520000" cy="2520000"/>
+            <wp:effectExtent l="0" t="0" r="0" b="0"/>
+            <wp:docPr id="1983624725" name="Рисунок 3"/>
+            <wp:cNvGraphicFramePr>
+              <a:graphicFrameLocks xmlns:a="http://schemas.openxmlformats.org/drawingml/2006/main" noChangeAspect="1"/>
+            </wp:cNvGraphicFramePr>
+            <a:graphic xmlns:a="http://schemas.openxmlformats.org/drawingml/2006/main">
+              <a:graphicData uri="http://schemas.openxmlformats.org/drawingml/2006/picture">
+                <pic:pic xmlns:pic="http://schemas.openxmlformats.org/drawingml/2006/picture">
+                  <pic:nvPicPr>
+                    <pic:cNvPr id="0" name="Picture 5"/>
+                    <pic:cNvPicPr>
+                      <a:picLocks noChangeAspect="1" noChangeArrowheads="1"/>
+                    </pic:cNvPicPr>
+                  </pic:nvPicPr>
+                  <pic:blipFill>
+                    <a:blip r:embed="rId8">
+                      <a:extLst>
+                        <a:ext uri="{28A0092B-C50C-407E-A947-70E740481C1C}">
+                          <a14:useLocalDpi xmlns:a14="http://schemas.microsoft.com/office/drawing/2010/main" val="0"/>
+                        </a:ext>
+                      </a:extLst>
+                    </a:blip>
+                    <a:srcRect/>
+                    <a:stretch>
+                      <a:fillRect/>
+                    </a:stretch>
+                  </pic:blipFill>
+                  <pic:spPr bwMode="auto">
+                    <a:xfrm>
+                      <a:off x="0" y="0"/>
+                      <a:ext cx="2520000" cy="2520000"/>
+                    </a:xfrm>
+                    <a:prstGeom prst="rect">
+                      <a:avLst/>
+                    </a:prstGeom>
+                    <a:noFill/>
+                    <a:ln>
+                      <a:noFill/>
+                    </a:ln>
+                  </pic:spPr>
+                </pic:pic>
+              </a:graphicData>
+            </a:graphic>
+          </wp:inline>
+        </w:drawing>
+      </w:r>
+    </w:p>
+    <w:p>
+      <w:pPr>
+        <w:spacing w:line="240" w:lineRule="auto"/>
+        <w:ind w:firstLine="709"/>
+        <w:jc w:val="center"/>
+        <w:rPr>
+          <w:rFonts w:ascii="Times New Roman" w:hAnsi="Times New Roman" w:cs="Times New Roman"/>
+          <w:sz w:val="28"/>
+          <w:szCs w:val="28"/>
+        </w:rPr>
+      </w:pPr>
+      <w:r>
+        <w:rPr>
+          <w:rFonts w:ascii="Times New Roman" w:hAnsi="Times New Roman" w:cs="Times New Roman"/>
+          <w:sz w:val="28"/>
+          <w:szCs w:val="28"/>
+        </w:rPr>
+        <w:t xml:space="preserve">Рисунок 2 – постер к треку </w:t>
+      </w:r>
+      <w:r>
+        <w:rPr>
+          <w:rFonts w:ascii="Times New Roman" w:hAnsi="Times New Roman" w:cs="Times New Roman"/>
+          <w:sz w:val="28"/>
+          <w:szCs w:val="28"/>
+          <w:lang w:val="en-US"/>
+        </w:rPr>
+        <w:t>I</w:t>
+      </w:r>
+      <w:r>
+        <w:rPr>
+          <w:rFonts w:ascii="Times New Roman" w:hAnsi="Times New Roman" w:cs="Times New Roman"/>
+          <w:sz w:val="28"/>
+          <w:szCs w:val="28"/>
+        </w:rPr>
+        <w:t>`</w:t>
+      </w:r>
+      <w:r>
+        <w:rPr>
+          <w:rFonts w:ascii="Times New Roman" w:hAnsi="Times New Roman" w:cs="Times New Roman"/>
+          <w:sz w:val="28"/>
+          <w:szCs w:val="28"/>
+          <w:lang w:val="en-US"/>
+        </w:rPr>
+        <w:t>m</w:t>
+      </w:r>
+      <w:r>
+        <w:rPr>
+          <w:rFonts w:ascii="Times New Roman" w:hAnsi="Times New Roman" w:cs="Times New Roman"/>
+          <w:sz w:val="28"/>
+          <w:szCs w:val="28"/>
+        </w:rPr>
+        <w:t xml:space="preserve"> </w:t>
+      </w:r>
+      <w:r>
+        <w:rPr>
+          <w:rFonts w:ascii="Times New Roman" w:hAnsi="Times New Roman" w:cs="Times New Roman"/>
+          <w:sz w:val="28"/>
+          <w:szCs w:val="28"/>
+          <w:lang w:val="en-US"/>
+        </w:rPr>
+        <w:t>doing</w:t>
+      </w:r>
+      <w:r>
+        <w:rPr>
+          <w:rFonts w:ascii="Times New Roman" w:hAnsi="Times New Roman" w:cs="Times New Roman"/>
+          <w:sz w:val="28"/>
+          <w:szCs w:val="28"/>
+        </w:rPr>
+        <w:t xml:space="preserve"> </w:t>
+      </w:r>
+      <w:r>
+        <w:rPr>
+          <w:rFonts w:ascii="Times New Roman" w:hAnsi="Times New Roman" w:cs="Times New Roman"/>
+          <w:sz w:val="28"/>
+          <w:szCs w:val="28"/>
+          <w:lang w:val="en-US"/>
+        </w:rPr>
+        <w:t>fine</w:t>
+      </w:r>
+      <w:r>
+        <w:rPr>
+          <w:rFonts w:ascii="Times New Roman" w:hAnsi="Times New Roman" w:cs="Times New Roman"/>
+          <w:sz w:val="28"/>
+          <w:szCs w:val="28"/>
+        </w:rPr>
+        <w:t xml:space="preserve"> (2024 год)</w:t>
+      </w:r>
+    </w:p>
+    <w:p>
+      <w:pPr>
+        <w:spacing w:after="0" w:line="240" w:lineRule="auto"/>
+        <w:ind w:firstLine="709"/>
+        <w:jc w:val="center"/>
+        <w:rPr>
+          <w:rFonts w:ascii="Times New Roman" w:hAnsi="Times New Roman" w:cs="Times New Roman"/>
+          <w:noProof/>
+          <w:sz w:val="28"/>
+          <w:szCs w:val="28"/>
+        </w:rPr>
+      </w:pPr>
+      <w:r>
+        <w:rPr>
+          <w:noProof/>
+        </w:rPr>
+        <w:drawing>
+          <wp:inline distT="0" distB="0" distL="0" distR="0" wp14:anchorId="4D87E469" wp14:editId="2F96B5EB">
+            <wp:extent cx="2520000" cy="2520000"/>
+            <wp:effectExtent l="0" t="0" r="0" b="0"/>
+            <wp:docPr id="1247177656" name="Рисунок 1"/>
+            <wp:cNvGraphicFramePr>
+              <a:graphicFrameLocks xmlns:a="http://schemas.openxmlformats.org/drawingml/2006/main" noChangeAspect="1"/>
+            </wp:cNvGraphicFramePr>
+            <a:graphic xmlns:a="http://schemas.openxmlformats.org/drawingml/2006/main">
+              <a:graphicData uri="http://schemas.openxmlformats.org/drawingml/2006/picture">
+                <pic:pic xmlns:pic="http://schemas.openxmlformats.org/drawingml/2006/picture">
+                  <pic:nvPicPr>
+                    <pic:cNvPr id="0" name="Picture 1"/>
+                    <pic:cNvPicPr>
+                      <a:picLocks noChangeAspect="1" noChangeArrowheads="1"/>
+                    </pic:cNvPicPr>
+                  </pic:nvPicPr>
+                  <pic:blipFill>
+                    <a:blip r:embed="rId9">
+                      <a:extLst>
+                        <a:ext uri="{28A0092B-C50C-407E-A947-70E740481C1C}">
+                          <a14:useLocalDpi xmlns:a14="http://schemas.microsoft.com/office/drawing/2010/main" val="0"/>
+                        </a:ext>
+                      </a:extLst>
+                    </a:blip>
+                    <a:srcRect/>
+                    <a:stretch>
+                      <a:fillRect/>
+                    </a:stretch>
+                  </pic:blipFill>
+                  <pic:spPr bwMode="auto">
+                    <a:xfrm>
+                      <a:off x="0" y="0"/>
+                      <a:ext cx="2520000" cy="2520000"/>
+                    </a:xfrm>
+                    <a:prstGeom prst="rect">
+                      <a:avLst/>
+                    </a:prstGeom>
+                    <a:noFill/>
+                    <a:ln>
+                      <a:noFill/>
+                    </a:ln>
+                  </pic:spPr>
+                </pic:pic>
+              </a:graphicData>
+            </a:graphic>
+          </wp:inline>
+        </w:drawing>
+      </w:r>
+    </w:p>
+    <w:p>
+      <w:pPr>
+        <w:spacing w:line="240" w:lineRule="auto"/>
+        <w:ind w:firstLine="709"/>
+        <w:jc w:val="center"/>
+        <w:rPr>
+          <w:rFonts w:ascii="Times New Roman" w:hAnsi="Times New Roman" w:cs="Times New Roman"/>
+          <w:noProof/>
+          <w:sz w:val="28"/>
+          <w:szCs w:val="28"/>
+        </w:rPr>
+      </w:pPr>
+      <w:r>
+        <w:rPr>
+          <w:rFonts w:ascii="Times New Roman" w:hAnsi="Times New Roman" w:cs="Times New Roman"/>
+          <w:noProof/>
+          <w:sz w:val="28"/>
+          <w:szCs w:val="28"/>
+        </w:rPr>
+        <w:t xml:space="preserve">Рисунок </w:t>
+      </w:r>
+      <w:r>
+        <w:rPr>
+          <w:rFonts w:ascii="Times New Roman" w:hAnsi="Times New Roman" w:cs="Times New Roman"/>
+          <w:noProof/>
+          <w:sz w:val="28"/>
+          <w:szCs w:val="28"/>
+        </w:rPr>
+        <w:t>3</w:t>
+      </w:r>
+      <w:r>
+        <w:rPr>
+          <w:rFonts w:ascii="Times New Roman" w:hAnsi="Times New Roman" w:cs="Times New Roman"/>
+          <w:noProof/>
+          <w:sz w:val="28"/>
+          <w:szCs w:val="28"/>
+        </w:rPr>
+        <w:t xml:space="preserve"> – постер к треку </w:t>
+      </w:r>
+      <w:r>
+        <w:rPr>
+          <w:rFonts w:ascii="Times New Roman" w:hAnsi="Times New Roman" w:cs="Times New Roman"/>
+          <w:noProof/>
+          <w:sz w:val="28"/>
+          <w:szCs w:val="28"/>
+          <w:lang w:val="en-US"/>
+        </w:rPr>
+        <w:t>ISSUES</w:t>
+      </w:r>
+      <w:r>
+        <w:rPr>
+          <w:rFonts w:ascii="Times New Roman" w:hAnsi="Times New Roman" w:cs="Times New Roman"/>
+          <w:noProof/>
+          <w:sz w:val="28"/>
+          <w:szCs w:val="28"/>
+        </w:rPr>
+        <w:t xml:space="preserve"> (2020 год)</w:t>
+      </w:r>
+    </w:p>
+    <w:p>
+      <w:pPr>
+        <w:spacing w:after="0" w:line="240" w:lineRule="auto"/>
+        <w:ind w:firstLine="709"/>
+        <w:jc w:val="center"/>
+        <w:rPr>
+          <w:rFonts w:ascii="Times New Roman" w:hAnsi="Times New Roman" w:cs="Times New Roman"/>
+          <w:noProof/>
+          <w:sz w:val="28"/>
+          <w:szCs w:val="28"/>
+        </w:rPr>
+      </w:pPr>
+      <w:r>
+        <w:rPr>
+          <w:noProof/>
+        </w:rPr>
+        <w:drawing>
+          <wp:inline distT="0" distB="0" distL="0" distR="0" wp14:anchorId="0C919F5C" wp14:editId="7F45A015">
+            <wp:extent cx="2520000" cy="2520000"/>
+            <wp:effectExtent l="0" t="0" r="0" b="0"/>
+            <wp:docPr id="983873202" name="Рисунок 4"/>
+            <wp:cNvGraphicFramePr>
+              <a:graphicFrameLocks xmlns:a="http://schemas.openxmlformats.org/drawingml/2006/main" noChangeAspect="1"/>
+            </wp:cNvGraphicFramePr>
+            <a:graphic xmlns:a="http://schemas.openxmlformats.org/drawingml/2006/main">
+              <a:graphicData uri="http://schemas.openxmlformats.org/drawingml/2006/picture">
+                <pic:pic xmlns:pic="http://schemas.openxmlformats.org/drawingml/2006/picture">
+                  <pic:nvPicPr>
+                    <pic:cNvPr id="0" name="Picture 7"/>
+                    <pic:cNvPicPr>
+                      <a:picLocks noChangeAspect="1" noChangeArrowheads="1"/>
+                    </pic:cNvPicPr>
+                  </pic:nvPicPr>
+                  <pic:blipFill>
+                    <a:blip r:embed="rId10">
+                      <a:extLst>
+                        <a:ext uri="{28A0092B-C50C-407E-A947-70E740481C1C}">
+                          <a14:useLocalDpi xmlns:a14="http://schemas.microsoft.com/office/drawing/2010/main" val="0"/>
+                        </a:ext>
+                      </a:extLst>
+                    </a:blip>
+                    <a:srcRect/>
+                    <a:stretch>
+                      <a:fillRect/>
+                    </a:stretch>
+                  </pic:blipFill>
+                  <pic:spPr bwMode="auto">
+                    <a:xfrm>
+                      <a:off x="0" y="0"/>
+                      <a:ext cx="2520000" cy="2520000"/>
+                    </a:xfrm>
+                    <a:prstGeom prst="rect">
+                      <a:avLst/>
+                    </a:prstGeom>
+                    <a:noFill/>
+                    <a:ln>
+                      <a:noFill/>
+                    </a:ln>
+                  </pic:spPr>
+                </pic:pic>
+              </a:graphicData>
+            </a:graphic>
+          </wp:inline>
+        </w:drawing>
+      </w:r>
+    </w:p>
+    <w:p>
+      <w:pPr>
+        <w:spacing w:line="240" w:lineRule="auto"/>
+        <w:ind w:firstLine="709"/>
+        <w:jc w:val="center"/>
+        <w:rPr>
+          <w:rFonts w:ascii="Times New Roman" w:hAnsi="Times New Roman" w:cs="Times New Roman"/>
+          <w:noProof/>
+          <w:sz w:val="28"/>
+          <w:szCs w:val="28"/>
+        </w:rPr>
+      </w:pPr>
+      <w:r>
+        <w:rPr>
+          <w:rFonts w:ascii="Times New Roman" w:hAnsi="Times New Roman" w:cs="Times New Roman"/>
+          <w:noProof/>
+          <w:sz w:val="28"/>
+          <w:szCs w:val="28"/>
+        </w:rPr>
+        <w:t xml:space="preserve">Рисунок 4 – постер к реку </w:t>
+      </w:r>
+      <w:r>
+        <w:rPr>
+          <w:rFonts w:ascii="Times New Roman" w:hAnsi="Times New Roman" w:cs="Times New Roman"/>
+          <w:noProof/>
+          <w:sz w:val="28"/>
+          <w:szCs w:val="28"/>
+          <w:lang w:val="en-US"/>
+        </w:rPr>
+        <w:t>Thief</w:t>
+      </w:r>
+      <w:r>
+        <w:rPr>
+          <w:rFonts w:ascii="Times New Roman" w:hAnsi="Times New Roman" w:cs="Times New Roman"/>
+          <w:noProof/>
+          <w:sz w:val="28"/>
+          <w:szCs w:val="28"/>
+        </w:rPr>
+        <w:t xml:space="preserve"> (2020 </w:t>
+      </w:r>
+      <w:r>
+        <w:rPr>
+          <w:rFonts w:ascii="Times New Roman" w:hAnsi="Times New Roman" w:cs="Times New Roman"/>
+          <w:noProof/>
+          <w:sz w:val="28"/>
+          <w:szCs w:val="28"/>
+        </w:rPr>
+        <w:t>год</w:t>
+      </w:r>
+      <w:r>
+        <w:rPr>
+          <w:rFonts w:ascii="Times New Roman" w:hAnsi="Times New Roman" w:cs="Times New Roman"/>
+          <w:noProof/>
+          <w:sz w:val="28"/>
+          <w:szCs w:val="28"/>
+        </w:rPr>
+        <w:t>)</w:t>
       </w:r>
     </w:p>
     <w:p>
@@ -924,16 +3147,164 @@
           <w:noProof/>
           <w:sz w:val="28"/>
           <w:szCs w:val="28"/>
-        </w:rPr>
-      </w:pPr>
-      <w:r>
-        <w:rPr>
-          <w:rFonts w:ascii="Times New Roman" w:hAnsi="Times New Roman" w:cs="Times New Roman"/>
-          <w:noProof/>
-          <w:sz w:val="28"/>
-          <w:szCs w:val="28"/>
-        </w:rPr>
-        <w:t xml:space="preserve">Для создания хорошей обложки мной было выбрано одно из основных правил композиции правило третей. Данное правило заключается в том, что основной объект помещается в одну из треть изображения, а остальные две трети остаются свободными. </w:t>
+          <w:lang w:val="en-US"/>
+        </w:rPr>
+      </w:pPr>
+      <w:r>
+        <w:rPr>
+          <w:rFonts w:ascii="Times New Roman" w:hAnsi="Times New Roman" w:cs="Times New Roman"/>
+          <w:noProof/>
+          <w:sz w:val="28"/>
+          <w:szCs w:val="28"/>
+        </w:rPr>
+        <w:t>Постеры автора в большинстве случаев двух типов, либо фотосъемка либо стилизованные рисунки.</w:t>
+      </w:r>
+      <w:r>
+        <w:rPr>
+          <w:rFonts w:ascii="Times New Roman" w:hAnsi="Times New Roman" w:cs="Times New Roman"/>
+          <w:noProof/>
+          <w:sz w:val="28"/>
+          <w:szCs w:val="28"/>
+        </w:rPr>
+        <w:t xml:space="preserve"> Из-за чего было решено сделать постер не в </w:t>
+      </w:r>
+      <w:r>
+        <w:rPr>
+          <w:rFonts w:ascii="Times New Roman" w:hAnsi="Times New Roman" w:cs="Times New Roman"/>
+          <w:noProof/>
+          <w:sz w:val="28"/>
+          <w:szCs w:val="28"/>
+        </w:rPr>
+        <w:lastRenderedPageBreak/>
+        <w:t>стилистики рисунка, а в стилистики полуреализма, объединив несколько стилий автора.</w:t>
+      </w:r>
+    </w:p>
+    <w:p>
+      <w:pPr>
+        <w:spacing w:after="0" w:line="360" w:lineRule="auto"/>
+        <w:ind w:firstLine="709"/>
+        <w:jc w:val="both"/>
+        <w:rPr>
+          <w:rFonts w:ascii="Times New Roman" w:hAnsi="Times New Roman" w:cs="Times New Roman"/>
+          <w:noProof/>
+          <w:sz w:val="28"/>
+          <w:szCs w:val="28"/>
+        </w:rPr>
+      </w:pPr>
+      <w:r>
+        <w:rPr>
+          <w:rFonts w:ascii="Times New Roman" w:hAnsi="Times New Roman" w:cs="Times New Roman"/>
+          <w:noProof/>
+          <w:sz w:val="28"/>
+          <w:szCs w:val="28"/>
+        </w:rPr>
+        <w:t>Поиск референс набора производился на нескольких крупных веб-платформах</w:t>
+      </w:r>
+      <w:r>
+        <w:rPr>
+          <w:rFonts w:ascii="Times New Roman" w:hAnsi="Times New Roman" w:cs="Times New Roman"/>
+          <w:noProof/>
+          <w:sz w:val="28"/>
+          <w:szCs w:val="28"/>
+        </w:rPr>
+        <w:t xml:space="preserve">: </w:t>
+      </w:r>
+      <w:r>
+        <w:rPr>
+          <w:rFonts w:ascii="Times New Roman" w:hAnsi="Times New Roman" w:cs="Times New Roman"/>
+          <w:noProof/>
+          <w:sz w:val="28"/>
+          <w:szCs w:val="28"/>
+          <w:lang w:val="en-US"/>
+        </w:rPr>
+        <w:t>Pinterest</w:t>
+      </w:r>
+      <w:r>
+        <w:rPr>
+          <w:rFonts w:ascii="Times New Roman" w:hAnsi="Times New Roman" w:cs="Times New Roman"/>
+          <w:noProof/>
+          <w:sz w:val="28"/>
+          <w:szCs w:val="28"/>
+        </w:rPr>
+        <w:t xml:space="preserve">, </w:t>
+      </w:r>
+      <w:r>
+        <w:rPr>
+          <w:rFonts w:ascii="Times New Roman" w:hAnsi="Times New Roman" w:cs="Times New Roman"/>
+          <w:noProof/>
+          <w:sz w:val="28"/>
+          <w:szCs w:val="28"/>
+          <w:lang w:val="en-US"/>
+        </w:rPr>
+        <w:t>ArtStation</w:t>
+      </w:r>
+      <w:r>
+        <w:rPr>
+          <w:rFonts w:ascii="Times New Roman" w:hAnsi="Times New Roman" w:cs="Times New Roman"/>
+          <w:noProof/>
+          <w:sz w:val="28"/>
+          <w:szCs w:val="28"/>
+        </w:rPr>
+        <w:t xml:space="preserve"> и</w:t>
+      </w:r>
+      <w:r>
+        <w:rPr>
+          <w:rFonts w:ascii="Times New Roman" w:hAnsi="Times New Roman" w:cs="Times New Roman"/>
+          <w:noProof/>
+          <w:sz w:val="28"/>
+          <w:szCs w:val="28"/>
+        </w:rPr>
+        <w:t xml:space="preserve"> </w:t>
+      </w:r>
+      <w:r>
+        <w:rPr>
+          <w:rFonts w:ascii="Times New Roman" w:hAnsi="Times New Roman" w:cs="Times New Roman"/>
+          <w:noProof/>
+          <w:sz w:val="28"/>
+          <w:szCs w:val="28"/>
+          <w:lang w:val="en-US"/>
+        </w:rPr>
+        <w:t>Behance</w:t>
+      </w:r>
+      <w:r>
+        <w:rPr>
+          <w:rFonts w:ascii="Times New Roman" w:hAnsi="Times New Roman" w:cs="Times New Roman"/>
+          <w:noProof/>
+          <w:sz w:val="28"/>
+          <w:szCs w:val="28"/>
+        </w:rPr>
+        <w:t>.</w:t>
+      </w:r>
+    </w:p>
+    <w:p>
+      <w:pPr>
+        <w:spacing w:after="0" w:line="360" w:lineRule="auto"/>
+        <w:ind w:firstLine="709"/>
+        <w:jc w:val="both"/>
+        <w:rPr>
+          <w:rFonts w:ascii="Times New Roman" w:hAnsi="Times New Roman" w:cs="Times New Roman"/>
+          <w:noProof/>
+          <w:sz w:val="28"/>
+          <w:szCs w:val="28"/>
+        </w:rPr>
+      </w:pPr>
+      <w:r>
+        <w:rPr>
+          <w:rFonts w:ascii="Times New Roman" w:hAnsi="Times New Roman" w:cs="Times New Roman"/>
+          <w:noProof/>
+          <w:sz w:val="28"/>
+          <w:szCs w:val="28"/>
+        </w:rPr>
+        <w:t xml:space="preserve">Для придания реализма изображению было взято </w:t>
+      </w:r>
+      <w:r>
+        <w:rPr>
+          <w:rFonts w:ascii="Times New Roman" w:hAnsi="Times New Roman" w:cs="Times New Roman"/>
+          <w:noProof/>
+          <w:sz w:val="28"/>
+          <w:szCs w:val="28"/>
+        </w:rPr>
+        <w:t xml:space="preserve">одно из основных правил композиции правило третей. Данное правило заключается в том, что основной объект помещается в одну из треть изображения, а остальные две трети остаются свободными. </w:t>
       </w:r>
       <w:r>
         <w:rPr>
@@ -960,25 +3331,34 @@
           <w:sz w:val="28"/>
           <w:szCs w:val="28"/>
         </w:rPr>
-        <w:t>правило третей обычно приводит к созданию убедительных и хорошо скомпонованных кадров.</w:t>
-      </w:r>
-      <w:r>
-        <w:rPr>
-          <w:rFonts w:ascii="Times New Roman" w:hAnsi="Times New Roman" w:cs="Times New Roman"/>
-          <w:noProof/>
-          <w:sz w:val="28"/>
-          <w:szCs w:val="28"/>
-        </w:rPr>
-        <w:t xml:space="preserve"> </w:t>
-      </w:r>
-      <w:r>
-        <w:rPr>
-          <w:rFonts w:ascii="Times New Roman" w:hAnsi="Times New Roman" w:cs="Times New Roman"/>
-          <w:noProof/>
-          <w:sz w:val="28"/>
-          <w:szCs w:val="28"/>
-        </w:rPr>
-        <w:t>Пример работы с использованием правила третей для фотографии изображен на рисунке 1.</w:t>
+        <w:t xml:space="preserve">правило третей обычно приводит к созданию убедительных и хорошо скомпонованных кадров. </w:t>
+      </w:r>
+      <w:r>
+        <w:rPr>
+          <w:rFonts w:ascii="Times New Roman" w:hAnsi="Times New Roman" w:cs="Times New Roman"/>
+          <w:noProof/>
+          <w:sz w:val="28"/>
+          <w:szCs w:val="28"/>
+        </w:rPr>
+        <w:t xml:space="preserve">Пример работы с использованием правила третей для фотографии изображен на рисунке </w:t>
+      </w:r>
+      <w:r>
+        <w:rPr>
+          <w:rFonts w:ascii="Times New Roman" w:hAnsi="Times New Roman" w:cs="Times New Roman"/>
+          <w:noProof/>
+          <w:sz w:val="28"/>
+          <w:szCs w:val="28"/>
+        </w:rPr>
+        <w:t>5</w:t>
+      </w:r>
+      <w:r>
+        <w:rPr>
+          <w:rFonts w:ascii="Times New Roman" w:hAnsi="Times New Roman" w:cs="Times New Roman"/>
+          <w:noProof/>
+          <w:sz w:val="28"/>
+          <w:szCs w:val="28"/>
+        </w:rPr>
+        <w:t>.</w:t>
       </w:r>
     </w:p>
     <w:p>
@@ -1015,7 +3395,7 @@
                     </pic:cNvPicPr>
                   </pic:nvPicPr>
                   <pic:blipFill>
-                    <a:blip r:embed="rId6">
+                    <a:blip r:embed="rId11">
                       <a:extLst>
                         <a:ext uri="{28A0092B-C50C-407E-A947-70E740481C1C}">
                           <a14:useLocalDpi xmlns:a14="http://schemas.microsoft.com/office/drawing/2010/main" val="0"/>
@@ -1066,7 +3446,25 @@
           <w:sz w:val="28"/>
           <w:szCs w:val="28"/>
         </w:rPr>
-        <w:t>Рисунок 1 – Пример использования правила третей в фотографии</w:t>
+        <w:t xml:space="preserve">Рисунок </w:t>
+      </w:r>
+      <w:r>
+        <w:rPr>
+          <w:rFonts w:ascii="Times New Roman" w:hAnsi="Times New Roman" w:cs="Times New Roman"/>
+          <w:noProof/>
+          <w:sz w:val="28"/>
+          <w:szCs w:val="28"/>
+        </w:rPr>
+        <w:t>5</w:t>
+      </w:r>
+      <w:r>
+        <w:rPr>
+          <w:rFonts w:ascii="Times New Roman" w:hAnsi="Times New Roman" w:cs="Times New Roman"/>
+          <w:noProof/>
+          <w:sz w:val="28"/>
+          <w:szCs w:val="28"/>
+        </w:rPr>
+        <w:t xml:space="preserve"> – Пример использования правила третей в фотографии</w:t>
       </w:r>
     </w:p>
     <w:p>
@@ -1088,7 +3486,52 @@
           <w:sz w:val="28"/>
           <w:szCs w:val="28"/>
         </w:rPr>
-        <w:t>Основным предметом изобрженным на нашем постере будет дорожный знак. Пример дорожного знака и постера с ним изображен на рисунке 2.</w:t>
+        <w:t xml:space="preserve">Так же был взят американский знак стоп, который и станет оснвным </w:t>
+      </w:r>
+      <w:r>
+        <w:rPr>
+          <w:rFonts w:ascii="Times New Roman" w:hAnsi="Times New Roman" w:cs="Times New Roman"/>
+          <w:noProof/>
+          <w:sz w:val="28"/>
+          <w:szCs w:val="28"/>
+        </w:rPr>
+        <w:t>предметом изобрженным на нашем</w:t>
+      </w:r>
+      <w:r>
+        <w:rPr>
+          <w:rFonts w:ascii="Times New Roman" w:hAnsi="Times New Roman" w:cs="Times New Roman"/>
+          <w:noProof/>
+          <w:sz w:val="28"/>
+          <w:szCs w:val="28"/>
+        </w:rPr>
+        <w:t xml:space="preserve"> постере</w:t>
+      </w:r>
+      <w:r>
+        <w:rPr>
+          <w:rFonts w:ascii="Times New Roman" w:hAnsi="Times New Roman" w:cs="Times New Roman"/>
+          <w:noProof/>
+          <w:sz w:val="28"/>
+          <w:szCs w:val="28"/>
+        </w:rPr>
+        <w:t xml:space="preserve">. Пример дорожного знака и постера с ним изображен на рисунке </w:t>
+      </w:r>
+      <w:r>
+        <w:rPr>
+          <w:rFonts w:ascii="Times New Roman" w:hAnsi="Times New Roman" w:cs="Times New Roman"/>
+          <w:noProof/>
+          <w:sz w:val="28"/>
+          <w:szCs w:val="28"/>
+        </w:rPr>
+        <w:t>6</w:t>
+      </w:r>
+      <w:r>
+        <w:rPr>
+          <w:rFonts w:ascii="Times New Roman" w:hAnsi="Times New Roman" w:cs="Times New Roman"/>
+          <w:noProof/>
+          <w:sz w:val="28"/>
+          <w:szCs w:val="28"/>
+        </w:rPr>
+        <w:t>.</w:t>
       </w:r>
     </w:p>
     <w:p>
@@ -1112,7 +3555,7 @@
         </w:rPr>
         <w:lastRenderedPageBreak/>
         <w:drawing>
-          <wp:inline distT="0" distB="0" distL="0" distR="0" wp14:anchorId="603198A6" wp14:editId="5A6C0D18">
+          <wp:inline distT="0" distB="0" distL="0" distR="0" wp14:anchorId="603198A6" wp14:editId="4C6F5CA5">
             <wp:extent cx="2538061" cy="2952000"/>
             <wp:effectExtent l="0" t="0" r="0" b="1270"/>
             <wp:docPr id="1452083382" name="Рисунок 1" descr="Изображение выглядит как текст, знак, указатель, на открытом воздухе&#10;&#10;Содержимое, созданное искусственным интеллектом, может быть неверным."/>
@@ -1129,7 +3572,7 @@
                     </pic:cNvPicPr>
                   </pic:nvPicPr>
                   <pic:blipFill rotWithShape="1">
-                    <a:blip r:embed="rId7" cstate="print">
+                    <a:blip r:embed="rId12" cstate="print">
                       <a:extLst>
                         <a:ext uri="{28A0092B-C50C-407E-A947-70E740481C1C}">
                           <a14:useLocalDpi xmlns:a14="http://schemas.microsoft.com/office/drawing/2010/main" val="0"/>
@@ -1166,8 +3609,11 @@
         </w:drawing>
       </w:r>
       <w:r>
+        <w:rPr>
+          <w:noProof/>
+        </w:rPr>
         <w:drawing>
-          <wp:inline distT="0" distB="0" distL="0" distR="0" wp14:anchorId="777F2AB6" wp14:editId="2F5491D9">
+          <wp:inline distT="0" distB="0" distL="0" distR="0" wp14:anchorId="777F2AB6" wp14:editId="00E0D59B">
             <wp:extent cx="2952000" cy="2952000"/>
             <wp:effectExtent l="0" t="0" r="1270" b="1270"/>
             <wp:docPr id="1436842045" name="Рисунок 2" descr="Изображение пина-истории"/>
@@ -1184,7 +3630,7 @@
                     </pic:cNvPicPr>
                   </pic:nvPicPr>
                   <pic:blipFill>
-                    <a:blip r:embed="rId8" cstate="print">
+                    <a:blip r:embed="rId13" cstate="print">
                       <a:extLst>
                         <a:ext uri="{28A0092B-C50C-407E-A947-70E740481C1C}">
                           <a14:useLocalDpi xmlns:a14="http://schemas.microsoft.com/office/drawing/2010/main" val="0"/>
@@ -1233,7 +3679,23 @@
           <w:sz w:val="28"/>
           <w:szCs w:val="28"/>
         </w:rPr>
-        <w:t>Рисунок 2 – Дорожный знак стоп и постер с ним</w:t>
+        <w:t xml:space="preserve">Рисунок </w:t>
+      </w:r>
+      <w:r>
+        <w:rPr>
+          <w:rFonts w:ascii="Times New Roman" w:hAnsi="Times New Roman" w:cs="Times New Roman"/>
+          <w:sz w:val="28"/>
+          <w:szCs w:val="28"/>
+        </w:rPr>
+        <w:t>6</w:t>
+      </w:r>
+      <w:r>
+        <w:rPr>
+          <w:rFonts w:ascii="Times New Roman" w:hAnsi="Times New Roman" w:cs="Times New Roman"/>
+          <w:sz w:val="28"/>
+          <w:szCs w:val="28"/>
+        </w:rPr>
+        <w:t xml:space="preserve"> – Дорожный знак стоп и постер с ним</w:t>
       </w:r>
     </w:p>
     <w:p>
@@ -1273,7 +3735,25 @@
           <w:sz w:val="28"/>
           <w:szCs w:val="28"/>
         </w:rPr>
-        <w:t xml:space="preserve">сбоя будут использоваться глич эффекты и эффект старых </w:t>
+        <w:t xml:space="preserve">сбоя </w:t>
+      </w:r>
+      <w:r>
+        <w:rPr>
+          <w:rFonts w:ascii="Times New Roman" w:hAnsi="Times New Roman" w:cs="Times New Roman"/>
+          <w:noProof/>
+          <w:sz w:val="28"/>
+          <w:szCs w:val="28"/>
+        </w:rPr>
+        <w:t xml:space="preserve">и общей стилизации постера </w:t>
+      </w:r>
+      <w:r>
+        <w:rPr>
+          <w:rFonts w:ascii="Times New Roman" w:hAnsi="Times New Roman" w:cs="Times New Roman"/>
+          <w:noProof/>
+          <w:sz w:val="28"/>
+          <w:szCs w:val="28"/>
+        </w:rPr>
+        <w:t xml:space="preserve">будут использоваться глич эффекты и эффект старых </w:t>
       </w:r>
       <w:r>
         <w:rPr>
@@ -1301,7 +3781,25 @@
           <w:sz w:val="28"/>
           <w:szCs w:val="28"/>
         </w:rPr>
-        <w:t>касет. Данные эффекты изображены на рисунке 3.</w:t>
+        <w:t xml:space="preserve">касет. Данные эффекты изображены на рисунке </w:t>
+      </w:r>
+      <w:r>
+        <w:rPr>
+          <w:rFonts w:ascii="Times New Roman" w:hAnsi="Times New Roman" w:cs="Times New Roman"/>
+          <w:noProof/>
+          <w:sz w:val="28"/>
+          <w:szCs w:val="28"/>
+        </w:rPr>
+        <w:t>7</w:t>
+      </w:r>
+      <w:r>
+        <w:rPr>
+          <w:rFonts w:ascii="Times New Roman" w:hAnsi="Times New Roman" w:cs="Times New Roman"/>
+          <w:noProof/>
+          <w:sz w:val="28"/>
+          <w:szCs w:val="28"/>
+        </w:rPr>
+        <w:t>.</w:t>
       </w:r>
     </w:p>
     <w:p>
@@ -1341,7 +3839,7 @@
                     </pic:cNvPicPr>
                   </pic:nvPicPr>
                   <pic:blipFill rotWithShape="1">
-                    <a:blip r:embed="rId9">
+                    <a:blip r:embed="rId14">
                       <a:extLst>
                         <a:ext uri="{28A0092B-C50C-407E-A947-70E740481C1C}">
                           <a14:useLocalDpi xmlns:a14="http://schemas.microsoft.com/office/drawing/2010/main" val="0"/>
@@ -1385,7 +3883,7 @@
           <w:szCs w:val="28"/>
         </w:rPr>
         <w:drawing>
-          <wp:inline distT="0" distB="0" distL="0" distR="0" wp14:anchorId="45F370FF" wp14:editId="47374B67">
+          <wp:inline distT="0" distB="0" distL="0" distR="0" wp14:anchorId="45F370FF" wp14:editId="55C4FB12">
             <wp:extent cx="2736000" cy="2736000"/>
             <wp:effectExtent l="0" t="0" r="7620" b="7620"/>
             <wp:docPr id="1406701318" name="Рисунок 7" descr="Изображение выглядит как снимок экрана, синий, Красочность, Цвет Majorelle blue&#10;&#10;Содержимое, созданное искусственным интеллектом, может быть неверным."/>
@@ -1402,7 +3900,7 @@
                     </pic:cNvPicPr>
                   </pic:nvPicPr>
                   <pic:blipFill rotWithShape="1">
-                    <a:blip r:embed="rId10" cstate="print">
+                    <a:blip r:embed="rId15" cstate="print">
                       <a:extLst>
                         <a:ext uri="{28A0092B-C50C-407E-A947-70E740481C1C}">
                           <a14:useLocalDpi xmlns:a14="http://schemas.microsoft.com/office/drawing/2010/main" val="0"/>
@@ -1456,7 +3954,23 @@
           <w:sz w:val="28"/>
           <w:szCs w:val="28"/>
         </w:rPr>
-        <w:t>Рисунок 3 – Пост-эффекты для постера</w:t>
+        <w:t xml:space="preserve">Рисунок </w:t>
+      </w:r>
+      <w:r>
+        <w:rPr>
+          <w:rFonts w:ascii="Times New Roman" w:hAnsi="Times New Roman" w:cs="Times New Roman"/>
+          <w:sz w:val="28"/>
+          <w:szCs w:val="28"/>
+        </w:rPr>
+        <w:t>7</w:t>
+      </w:r>
+      <w:r>
+        <w:rPr>
+          <w:rFonts w:ascii="Times New Roman" w:hAnsi="Times New Roman" w:cs="Times New Roman"/>
+          <w:sz w:val="28"/>
+          <w:szCs w:val="28"/>
+        </w:rPr>
+        <w:t xml:space="preserve"> – Пост-эффекты для постера</w:t>
       </w:r>
     </w:p>
     <w:p>
@@ -1478,7 +3992,52 @@
           <w:sz w:val="28"/>
           <w:szCs w:val="28"/>
         </w:rPr>
-        <w:t xml:space="preserve">Для создания большего количества деталей по краям изображения будут добавлены следы стекшей краски (рисунок 4). </w:t>
+        <w:t>А также д</w:t>
+      </w:r>
+      <w:r>
+        <w:rPr>
+          <w:rFonts w:ascii="Times New Roman" w:hAnsi="Times New Roman" w:cs="Times New Roman"/>
+          <w:noProof/>
+          <w:sz w:val="28"/>
+          <w:szCs w:val="28"/>
+        </w:rPr>
+        <w:t xml:space="preserve">ля создания большего количества деталей </w:t>
+      </w:r>
+      <w:r>
+        <w:rPr>
+          <w:rFonts w:ascii="Times New Roman" w:hAnsi="Times New Roman" w:cs="Times New Roman"/>
+          <w:noProof/>
+          <w:sz w:val="28"/>
+          <w:szCs w:val="28"/>
+        </w:rPr>
+        <w:t xml:space="preserve"> </w:t>
+      </w:r>
+      <w:r>
+        <w:rPr>
+          <w:rFonts w:ascii="Times New Roman" w:hAnsi="Times New Roman" w:cs="Times New Roman"/>
+          <w:noProof/>
+          <w:sz w:val="28"/>
+          <w:szCs w:val="28"/>
+        </w:rPr>
+        <w:t xml:space="preserve">по краям изображения будут добавлены следы стекшей краски (рисунок </w:t>
+      </w:r>
+      <w:r>
+        <w:rPr>
+          <w:rFonts w:ascii="Times New Roman" w:hAnsi="Times New Roman" w:cs="Times New Roman"/>
+          <w:noProof/>
+          <w:sz w:val="28"/>
+          <w:szCs w:val="28"/>
+        </w:rPr>
+        <w:t>8</w:t>
+      </w:r>
+      <w:r>
+        <w:rPr>
+          <w:rFonts w:ascii="Times New Roman" w:hAnsi="Times New Roman" w:cs="Times New Roman"/>
+          <w:noProof/>
+          <w:sz w:val="28"/>
+          <w:szCs w:val="28"/>
+        </w:rPr>
+        <w:t xml:space="preserve">). </w:t>
       </w:r>
     </w:p>
     <w:p>
@@ -1515,7 +4074,7 @@
                     </pic:cNvPicPr>
                   </pic:nvPicPr>
                   <pic:blipFill>
-                    <a:blip r:embed="rId11">
+                    <a:blip r:embed="rId16">
                       <a:extLst>
                         <a:ext uri="{28A0092B-C50C-407E-A947-70E740481C1C}">
                           <a14:useLocalDpi xmlns:a14="http://schemas.microsoft.com/office/drawing/2010/main" val="0"/>
@@ -1564,7 +4123,23 @@
           <w:sz w:val="28"/>
           <w:szCs w:val="28"/>
         </w:rPr>
-        <w:t>Рисунок 4 – Эффект</w:t>
+        <w:t xml:space="preserve">Рисунок </w:t>
+      </w:r>
+      <w:r>
+        <w:rPr>
+          <w:rFonts w:ascii="Times New Roman" w:hAnsi="Times New Roman" w:cs="Times New Roman"/>
+          <w:sz w:val="28"/>
+          <w:szCs w:val="28"/>
+        </w:rPr>
+        <w:t>8</w:t>
+      </w:r>
+      <w:r>
+        <w:rPr>
+          <w:rFonts w:ascii="Times New Roman" w:hAnsi="Times New Roman" w:cs="Times New Roman"/>
+          <w:sz w:val="28"/>
+          <w:szCs w:val="28"/>
+        </w:rPr>
+        <w:t xml:space="preserve"> – Эффект</w:t>
       </w:r>
       <w:r>
         <w:rPr>
@@ -1638,7 +4213,55 @@
           <w:sz w:val="28"/>
           <w:szCs w:val="28"/>
         </w:rPr>
-        <w:t xml:space="preserve"> В-первой был создан черновой вариант работы проработана основа постера. Во-второй были добавлены цвета изменена цвето-коррекция убраны следы красной краски с краю изображения. В финальной же итерации были добавлены неоновые цветовые контрасты, эффекты подтекшей сверху краски. Изменен стиль надписи названия трека для соответствия общей концепции постера. Каждая итерация показана на рисунках 5–7.</w:t>
+        <w:t xml:space="preserve"> В-первой был создан черновой вариант работы</w:t>
+      </w:r>
+      <w:r>
+        <w:rPr>
+          <w:rFonts w:ascii="Times New Roman" w:hAnsi="Times New Roman" w:cs="Times New Roman"/>
+          <w:sz w:val="28"/>
+          <w:szCs w:val="28"/>
+        </w:rPr>
+        <w:t>,</w:t>
+      </w:r>
+      <w:r>
+        <w:rPr>
+          <w:rFonts w:ascii="Times New Roman" w:hAnsi="Times New Roman" w:cs="Times New Roman"/>
+          <w:sz w:val="28"/>
+          <w:szCs w:val="28"/>
+        </w:rPr>
+        <w:t xml:space="preserve"> проработана основа постера. Во-второй были добавлены цвета изменена цвето-коррекция убраны следы красной краски с краю изображения. В финальной же итерации были добавлены неоновые цветовые контрасты, эффекты подтекшей сверху краски. Изменен стиль надписи названия трека для соответствия общей концепции постера. Каждая итерация показана на рисунках </w:t>
+      </w:r>
+      <w:r>
+        <w:rPr>
+          <w:rFonts w:ascii="Times New Roman" w:hAnsi="Times New Roman" w:cs="Times New Roman"/>
+          <w:sz w:val="28"/>
+          <w:szCs w:val="28"/>
+        </w:rPr>
+        <w:t>9</w:t>
+      </w:r>
+      <w:r>
+        <w:rPr>
+          <w:rFonts w:ascii="Times New Roman" w:hAnsi="Times New Roman" w:cs="Times New Roman"/>
+          <w:sz w:val="28"/>
+          <w:szCs w:val="28"/>
+        </w:rPr>
+        <w:t>–</w:t>
+      </w:r>
+      <w:r>
+        <w:rPr>
+          <w:rFonts w:ascii="Times New Roman" w:hAnsi="Times New Roman" w:cs="Times New Roman"/>
+          <w:sz w:val="28"/>
+          <w:szCs w:val="28"/>
+        </w:rPr>
+        <w:t>11</w:t>
+      </w:r>
+      <w:r>
+        <w:rPr>
+          <w:rFonts w:ascii="Times New Roman" w:hAnsi="Times New Roman" w:cs="Times New Roman"/>
+          <w:sz w:val="28"/>
+          <w:szCs w:val="28"/>
+        </w:rPr>
+        <w:t>.</w:t>
       </w:r>
     </w:p>
     <w:p>
@@ -1661,9 +4284,9 @@
         </w:rPr>
         <w:lastRenderedPageBreak/>
         <w:drawing>
-          <wp:inline distT="0" distB="0" distL="0" distR="0" wp14:anchorId="49818571" wp14:editId="2D9525C6">
-            <wp:extent cx="3589643" cy="3600000"/>
-            <wp:effectExtent l="0" t="0" r="0" b="635"/>
+          <wp:inline distT="0" distB="0" distL="0" distR="0" wp14:anchorId="49818571" wp14:editId="43C1177A">
+            <wp:extent cx="3230679" cy="3240000"/>
+            <wp:effectExtent l="0" t="0" r="8255" b="0"/>
             <wp:docPr id="1120375932" name="Рисунок 3" descr="Изображение выглядит как текст, плакат, Графика, графический дизайн&#10;&#10;Содержимое, созданное искусственным интеллектом, может быть неверным."/>
             <wp:cNvGraphicFramePr>
               <a:graphicFrameLocks xmlns:a="http://schemas.openxmlformats.org/drawingml/2006/main" noChangeAspect="1"/>
@@ -1678,7 +4301,7 @@
                     </pic:cNvPicPr>
                   </pic:nvPicPr>
                   <pic:blipFill>
-                    <a:blip r:embed="rId12" cstate="print">
+                    <a:blip r:embed="rId17" cstate="print">
                       <a:extLst>
                         <a:ext uri="{28A0092B-C50C-407E-A947-70E740481C1C}">
                           <a14:useLocalDpi xmlns:a14="http://schemas.microsoft.com/office/drawing/2010/main" val="0"/>
@@ -1693,7 +4316,7 @@
                   <pic:spPr bwMode="auto">
                     <a:xfrm>
                       <a:off x="0" y="0"/>
-                      <a:ext cx="3589643" cy="3600000"/>
+                      <a:ext cx="3230679" cy="3240000"/>
                     </a:xfrm>
                     <a:prstGeom prst="rect">
                       <a:avLst/>
@@ -1727,7 +4350,23 @@
           <w:sz w:val="28"/>
           <w:szCs w:val="28"/>
         </w:rPr>
-        <w:t>Рисунок 5 – Первый «черновой» вариант постера</w:t>
+        <w:t xml:space="preserve">Рисунок </w:t>
+      </w:r>
+      <w:r>
+        <w:rPr>
+          <w:rFonts w:ascii="Times New Roman" w:hAnsi="Times New Roman" w:cs="Times New Roman"/>
+          <w:sz w:val="28"/>
+          <w:szCs w:val="28"/>
+        </w:rPr>
+        <w:t>9</w:t>
+      </w:r>
+      <w:r>
+        <w:rPr>
+          <w:rFonts w:ascii="Times New Roman" w:hAnsi="Times New Roman" w:cs="Times New Roman"/>
+          <w:sz w:val="28"/>
+          <w:szCs w:val="28"/>
+        </w:rPr>
+        <w:t xml:space="preserve"> – Первый «черновой» вариант постера</w:t>
       </w:r>
     </w:p>
     <w:p>
@@ -1749,9 +4388,9 @@
           <w:szCs w:val="28"/>
         </w:rPr>
         <w:drawing>
-          <wp:inline distT="0" distB="0" distL="0" distR="0" wp14:anchorId="3F481EAE" wp14:editId="17A4EFED">
-            <wp:extent cx="3589643" cy="3600000"/>
-            <wp:effectExtent l="0" t="0" r="0" b="635"/>
+          <wp:inline distT="0" distB="0" distL="0" distR="0" wp14:anchorId="3F481EAE" wp14:editId="333CEF9D">
+            <wp:extent cx="3230679" cy="3240000"/>
+            <wp:effectExtent l="0" t="0" r="8255" b="0"/>
             <wp:docPr id="264731129" name="Рисунок 4" descr="Изображение выглядит как текст, Графика, графический дизайн, искусство&#10;&#10;Содержимое, созданное искусственным интеллектом, может быть неверным."/>
             <wp:cNvGraphicFramePr>
               <a:graphicFrameLocks xmlns:a="http://schemas.openxmlformats.org/drawingml/2006/main" noChangeAspect="1"/>
@@ -1766,7 +4405,7 @@
                     </pic:cNvPicPr>
                   </pic:nvPicPr>
                   <pic:blipFill>
-                    <a:blip r:embed="rId13" cstate="print">
+                    <a:blip r:embed="rId18" cstate="print">
                       <a:extLst>
                         <a:ext uri="{28A0092B-C50C-407E-A947-70E740481C1C}">
                           <a14:useLocalDpi xmlns:a14="http://schemas.microsoft.com/office/drawing/2010/main" val="0"/>
@@ -1781,7 +4420,7 @@
                   <pic:spPr bwMode="auto">
                     <a:xfrm>
                       <a:off x="0" y="0"/>
-                      <a:ext cx="3589643" cy="3600000"/>
+                      <a:ext cx="3230679" cy="3240000"/>
                     </a:xfrm>
                     <a:prstGeom prst="rect">
                       <a:avLst/>
@@ -1815,7 +4454,23 @@
           <w:sz w:val="28"/>
           <w:szCs w:val="28"/>
         </w:rPr>
-        <w:t>Рисунок 6 – Добавление цветов изменение цвето-коррекции</w:t>
+        <w:t xml:space="preserve">Рисунок </w:t>
+      </w:r>
+      <w:r>
+        <w:rPr>
+          <w:rFonts w:ascii="Times New Roman" w:hAnsi="Times New Roman" w:cs="Times New Roman"/>
+          <w:sz w:val="28"/>
+          <w:szCs w:val="28"/>
+        </w:rPr>
+        <w:t>10</w:t>
+      </w:r>
+      <w:r>
+        <w:rPr>
+          <w:rFonts w:ascii="Times New Roman" w:hAnsi="Times New Roman" w:cs="Times New Roman"/>
+          <w:sz w:val="28"/>
+          <w:szCs w:val="28"/>
+        </w:rPr>
+        <w:t xml:space="preserve"> – Добавление цветов изменение цвето-коррекции</w:t>
       </w:r>
     </w:p>
     <w:p>
@@ -1838,9 +4493,9 @@
         </w:rPr>
         <w:lastRenderedPageBreak/>
         <w:drawing>
-          <wp:inline distT="0" distB="0" distL="0" distR="0" wp14:anchorId="5A81A276" wp14:editId="15667BB8">
-            <wp:extent cx="3589640" cy="3600000"/>
-            <wp:effectExtent l="0" t="0" r="0" b="635"/>
+          <wp:inline distT="0" distB="0" distL="0" distR="0" wp14:anchorId="5A81A276" wp14:editId="5605AFFA">
+            <wp:extent cx="3230676" cy="3240000"/>
+            <wp:effectExtent l="0" t="0" r="8255" b="0"/>
             <wp:docPr id="618286707" name="Рисунок 5" descr="Изображение выглядит как искусство, текст, Графика, графический дизайн&#10;&#10;Содержимое, созданное искусственным интеллектом, может быть неверным."/>
             <wp:cNvGraphicFramePr>
               <a:graphicFrameLocks xmlns:a="http://schemas.openxmlformats.org/drawingml/2006/main" noChangeAspect="1"/>
@@ -1855,7 +4510,7 @@
                     </pic:cNvPicPr>
                   </pic:nvPicPr>
                   <pic:blipFill>
-                    <a:blip r:embed="rId14" cstate="print">
+                    <a:blip r:embed="rId19" cstate="print">
                       <a:extLst>
                         <a:ext uri="{28A0092B-C50C-407E-A947-70E740481C1C}">
                           <a14:useLocalDpi xmlns:a14="http://schemas.microsoft.com/office/drawing/2010/main" val="0"/>
@@ -1870,7 +4525,7 @@
                   <pic:spPr bwMode="auto">
                     <a:xfrm>
                       <a:off x="0" y="0"/>
-                      <a:ext cx="3589640" cy="3600000"/>
+                      <a:ext cx="3230676" cy="3240000"/>
                     </a:xfrm>
                     <a:prstGeom prst="rect">
                       <a:avLst/>
@@ -1904,7 +4559,23 @@
           <w:sz w:val="28"/>
           <w:szCs w:val="28"/>
         </w:rPr>
-        <w:t>Рисунок 7 – Финальная работа</w:t>
+        <w:t xml:space="preserve">Рисунок </w:t>
+      </w:r>
+      <w:r>
+        <w:rPr>
+          <w:rFonts w:ascii="Times New Roman" w:hAnsi="Times New Roman" w:cs="Times New Roman"/>
+          <w:sz w:val="28"/>
+          <w:szCs w:val="28"/>
+        </w:rPr>
+        <w:t>11</w:t>
+      </w:r>
+      <w:r>
+        <w:rPr>
+          <w:rFonts w:ascii="Times New Roman" w:hAnsi="Times New Roman" w:cs="Times New Roman"/>
+          <w:sz w:val="28"/>
+          <w:szCs w:val="28"/>
+        </w:rPr>
+        <w:t xml:space="preserve"> – Финальная работа</w:t>
       </w:r>
     </w:p>
     <w:p>
@@ -2743,6 +5414,7 @@
   <w:style w:type="character" w:default="1" w:styleId="a0">
     <w:name w:val="Default Paragraph Font"/>
     <w:uiPriority w:val="1"/>
+    <w:semiHidden/>
     <w:unhideWhenUsed/>
   </w:style>
   <w:style w:type="table" w:default="1" w:styleId="a1">

</xml_diff>